<commit_message>
feat: sync 5D Mind Model and Qian Xuesen Formal Proof (ZH & EN) bilingual papers and master monograph
</commit_message>
<xml_diff>
--- a/The_5D_Conscience_Holographic_Metacognition_OS_Full_Monograph.docx
+++ b/The_5D_Conscience_Holographic_Metacognition_OS_Full_Monograph.docx
@@ -2,7 +2,7 @@
 <file path=word/document.xml><?xml version="1.0" encoding="utf-8"?>
 <w:document xmlns:w="http://schemas.openxmlformats.org/wordprocessingml/2006/main" xmlns:m="http://schemas.openxmlformats.org/officeDocument/2006/math" xmlns:r="http://schemas.openxmlformats.org/officeDocument/2006/relationships" xmlns:o="urn:schemas-microsoft-com:office:office" xmlns:v="urn:schemas-microsoft-com:vml" xmlns:w10="urn:schemas-microsoft-com:office:word" xmlns:a="http://schemas.openxmlformats.org/drawingml/2006/main" xmlns:pic="http://schemas.openxmlformats.org/drawingml/2006/picture" xmlns:wp="http://schemas.openxmlformats.org/drawingml/2006/wordprocessingDrawing">
   <w:body>
-    <w:bookmarkStart w:id="14" w:name="X171dc4d361a454244fb2778bd93d7f08cfb35d7"/>
+    <w:bookmarkStart w:id="15" w:name="X171dc4d361a454244fb2778bd93d7f08cfb35d7"/>
     <w:p>
       <w:pPr>
         <w:pStyle w:val="Heading1"/>
@@ -42,6 +42,19 @@
           <w:b/>
           <w:bCs/>
         </w:rPr>
+        <w:t xml:space="preserve">Affiliation</w:t>
+      </w:r>
+      <w:r>
+        <w:t xml:space="preserve">: Value Chain Physics &amp; Metacognition Cybernetics Laboratory, Beijing, China</w:t>
+      </w:r>
+      <w:r>
+        <w:br/>
+      </w:r>
+      <w:r>
+        <w:rPr>
+          <w:b/>
+          <w:bCs/>
+        </w:rPr>
         <w:t xml:space="preserve">Nature</w:t>
       </w:r>
       <w:r>
@@ -56,16 +69,638 @@
       </w:r>
     </w:p>
     <w:bookmarkEnd w:id="9"/>
-    <w:bookmarkStart w:id="13" w:name="X3e8b6c97809b6d5e378ab7e129971ee1dfcf6f4"/>
+    <w:bookmarkStart w:id="10" w:name="abstract"/>
     <w:p>
       <w:pPr>
         <w:pStyle w:val="Heading2"/>
       </w:pPr>
       <w:r>
+        <w:t xml:space="preserve">Abstract</w:t>
+      </w:r>
+    </w:p>
+    <w:p>
+      <w:pPr>
+        <w:pStyle w:val="FirstParagraph"/>
+      </w:pPr>
+      <w:r>
+        <w:t xml:space="preserve">As autonomous artificial intelligence systems scale across sociotechnical infrastructures, first-order optimization paradigms encounter fundamental structural limitations regarding behavioral alignment, non-stationary distribution shifts, and adversarial exploitation. This paper presents the</w:t>
+      </w:r>
+      <w:r>
+        <w:t xml:space="preserve"> </w:t>
+      </w:r>
+      <w:r>
+        <w:rPr>
+          <w:b/>
+          <w:bCs/>
+        </w:rPr>
+        <w:t xml:space="preserve">5D Mind Model</w:t>
+      </w:r>
+      <w:r>
+        <w:t xml:space="preserve">, a formal cybernetic paradigm for governance and self-regulation in Open Complex Giant Systems (OCGS). By modeling the cognitive manifold across a five-dimensional topological space</w:t>
+      </w:r>
+      <w:r>
+        <w:t xml:space="preserve"> </w:t>
+      </w:r>
+      <m:oMath>
+        <m:r>
+          <m:rPr>
+            <m:scr m:val="script"/>
+            <m:sty m:val="p"/>
+          </m:rPr>
+          <m:t>M</m:t>
+        </m:r>
+        <m:r>
+          <m:rPr>
+            <m:sty m:val="p"/>
+          </m:rPr>
+          <m:t>=</m:t>
+        </m:r>
+        <m:sSup>
+          <m:e>
+            <m:r>
+              <m:rPr>
+                <m:scr m:val="double-struck"/>
+                <m:sty m:val="p"/>
+              </m:rPr>
+              <m:t>R</m:t>
+            </m:r>
+          </m:e>
+          <m:sup>
+            <m:r>
+              <m:t>3</m:t>
+            </m:r>
+          </m:sup>
+        </m:sSup>
+        <m:r>
+          <m:rPr>
+            <m:sty m:val="p"/>
+          </m:rPr>
+          <m:t>×</m:t>
+        </m:r>
+        <m:sSup>
+          <m:e>
+            <m:r>
+              <m:rPr>
+                <m:scr m:val="double-struck"/>
+                <m:sty m:val="p"/>
+              </m:rPr>
+              <m:t>T</m:t>
+            </m:r>
+          </m:e>
+          <m:sup>
+            <m:r>
+              <m:t>1</m:t>
+            </m:r>
+          </m:sup>
+        </m:sSup>
+        <m:r>
+          <m:rPr>
+            <m:sty m:val="p"/>
+          </m:rPr>
+          <m:t>×</m:t>
+        </m:r>
+        <m:sSup>
+          <m:e>
+            <m:r>
+              <m:rPr>
+                <m:scr m:val="double-struck"/>
+                <m:sty m:val="p"/>
+              </m:rPr>
+              <m:t>S</m:t>
+            </m:r>
+          </m:e>
+          <m:sup>
+            <m:r>
+              <m:t>1</m:t>
+            </m:r>
+          </m:sup>
+        </m:sSup>
+      </m:oMath>
+      <w:r>
+        <w:t xml:space="preserve">—comprising three-dimensional physical configuration space</w:t>
+      </w:r>
+      <w:r>
+        <w:t xml:space="preserve"> </w:t>
+      </w:r>
+      <m:oMath>
+        <m:sSup>
+          <m:e>
+            <m:r>
+              <m:rPr>
+                <m:scr m:val="double-struck"/>
+                <m:sty m:val="p"/>
+              </m:rPr>
+              <m:t>R</m:t>
+            </m:r>
+          </m:e>
+          <m:sup>
+            <m:r>
+              <m:t>3</m:t>
+            </m:r>
+          </m:sup>
+        </m:sSup>
+      </m:oMath>
+      <w:r>
+        <w:t xml:space="preserve">, one-dimensional monotonic historical time</w:t>
+      </w:r>
+      <w:r>
+        <w:t xml:space="preserve"> </w:t>
+      </w:r>
+      <m:oMath>
+        <m:sSup>
+          <m:e>
+            <m:r>
+              <m:rPr>
+                <m:scr m:val="double-struck"/>
+                <m:sty m:val="p"/>
+              </m:rPr>
+              <m:t>T</m:t>
+            </m:r>
+          </m:e>
+          <m:sup>
+            <m:r>
+              <m:t>1</m:t>
+            </m:r>
+          </m:sup>
+        </m:sSup>
+      </m:oMath>
+      <w:r>
+        <w:t xml:space="preserve">, and a one-dimensional compact conscience-metacognitive invariant circle</w:t>
+      </w:r>
+      <w:r>
+        <w:t xml:space="preserve"> </w:t>
+      </w:r>
+      <m:oMath>
+        <m:sSup>
+          <m:e>
+            <m:r>
+              <m:rPr>
+                <m:scr m:val="double-struck"/>
+                <m:sty m:val="p"/>
+              </m:rPr>
+              <m:t>S</m:t>
+            </m:r>
+          </m:e>
+          <m:sup>
+            <m:r>
+              <m:t>1</m:t>
+            </m:r>
+          </m:sup>
+        </m:sSup>
+      </m:oMath>
+      <w:r>
+        <w:t xml:space="preserve">—we establish a dual-track scientific validation framework uniting qualitative cybernetic control with quantitative neurobiological empirical verification. We prove that first-order task execution operators</w:t>
+      </w:r>
+      <w:r>
+        <w:t xml:space="preserve"> </w:t>
+      </w:r>
+      <m:oMath>
+        <m:sSub>
+          <m:e>
+            <m:r>
+              <m:rPr>
+                <m:scr m:val="script"/>
+                <m:sty m:val="p"/>
+              </m:rPr>
+              <m:t>T</m:t>
+            </m:r>
+          </m:e>
+          <m:sub>
+            <m:r>
+              <m:rPr>
+                <m:nor/>
+                <m:sty m:val="p"/>
+              </m:rPr>
+              <m:t>first-order</m:t>
+            </m:r>
+          </m:sub>
+        </m:sSub>
+      </m:oMath>
+      <w:r>
+        <w:t xml:space="preserve"> </w:t>
+      </w:r>
+      <w:r>
+        <w:t xml:space="preserve">are structurally bounded by Gödelian incompleteness and Goodhart heavy-tailed variance divergence (</w:t>
+      </w:r>
+      <m:oMath>
+        <m:r>
+          <m:t>α</m:t>
+        </m:r>
+        <m:r>
+          <m:rPr>
+            <m:sty m:val="p"/>
+          </m:rPr>
+          <m:t>&lt;</m:t>
+        </m:r>
+        <m:r>
+          <m:t>2</m:t>
+        </m:r>
+      </m:oMath>
+      <w:r>
+        <w:t xml:space="preserve">). To prevent non-equilibrium collapse, we formulate a second-order metacognitive operator</w:t>
+      </w:r>
+      <w:r>
+        <w:t xml:space="preserve"> </w:t>
+      </w:r>
+      <m:oMath>
+        <m:sSub>
+          <m:e>
+            <m:acc>
+              <m:accPr>
+                <m:chr m:val="̂"/>
+              </m:accPr>
+              <m:e>
+                <m:r>
+                  <m:rPr>
+                    <m:sty m:val="p"/>
+                  </m:rPr>
+                  <m:t>Ω</m:t>
+                </m:r>
+              </m:e>
+            </m:acc>
+          </m:e>
+          <m:sub>
+            <m:r>
+              <m:rPr>
+                <m:nor/>
+                <m:sty m:val="p"/>
+              </m:rPr>
+              <m:t>meta</m:t>
+            </m:r>
+          </m:sub>
+        </m:sSub>
+      </m:oMath>
+      <w:r>
+        <w:t xml:space="preserve"> </w:t>
+      </w:r>
+      <w:r>
+        <w:t xml:space="preserve">operating over a dynamic supp-set boundary</w:t>
+      </w:r>
+      <w:r>
+        <w:t xml:space="preserve"> </w:t>
+      </w:r>
+      <m:oMath>
+        <m:sSub>
+          <m:e>
+            <m:r>
+              <m:t>E</m:t>
+            </m:r>
+          </m:e>
+          <m:sub>
+            <m:r>
+              <m:rPr>
+                <m:nor/>
+                <m:sty m:val="p"/>
+              </m:rPr>
+              <m:t>supp</m:t>
+            </m:r>
+          </m:sub>
+        </m:sSub>
+      </m:oMath>
+      <w:r>
+        <w:t xml:space="preserve">. Thermodynamic entropy production is regulated via a novel residual entropy rate differential equation:</w:t>
+      </w:r>
+    </w:p>
+    <w:p>
+      <w:pPr>
+        <w:pStyle w:val="BodyText"/>
+      </w:pPr>
+      <m:oMathPara>
+        <m:oMathParaPr>
+          <m:jc m:val="center"/>
+        </m:oMathParaPr>
+        <m:oMath>
+          <m:f>
+            <m:fPr>
+              <m:type m:val="bar"/>
+            </m:fPr>
+            <m:num>
+              <m:r>
+                <m:t>d</m:t>
+              </m:r>
+              <m:sSub>
+                <m:e>
+                  <m:r>
+                    <m:t>S</m:t>
+                  </m:r>
+                </m:e>
+                <m:sub>
+                  <m:r>
+                    <m:rPr>
+                      <m:nor/>
+                      <m:sty m:val="p"/>
+                    </m:rPr>
+                    <m:t>sys</m:t>
+                  </m:r>
+                </m:sub>
+              </m:sSub>
+            </m:num>
+            <m:den>
+              <m:r>
+                <m:t>d</m:t>
+              </m:r>
+              <m:r>
+                <m:t>t</m:t>
+              </m:r>
+            </m:den>
+          </m:f>
+          <m:r>
+            <m:rPr>
+              <m:sty m:val="p"/>
+            </m:rPr>
+            <m:t>=</m:t>
+          </m:r>
+          <m:r>
+            <m:t>α</m:t>
+          </m:r>
+          <m:r>
+            <m:rPr>
+              <m:sty m:val="p"/>
+            </m:rPr>
+            <m:t>∥</m:t>
+          </m:r>
+          <m:r>
+            <m:rPr>
+              <m:sty m:val="p"/>
+            </m:rPr>
+            <m:t>∇</m:t>
+          </m:r>
+          <m:r>
+            <m:t>R</m:t>
+          </m:r>
+          <m:r>
+            <m:rPr>
+              <m:sty m:val="p"/>
+            </m:rPr>
+            <m:t>(</m:t>
+          </m:r>
+          <m:r>
+            <m:t>t</m:t>
+          </m:r>
+          <m:r>
+            <m:rPr>
+              <m:sty m:val="p"/>
+            </m:rPr>
+            <m:t>)</m:t>
+          </m:r>
+          <m:r>
+            <m:rPr>
+              <m:sty m:val="p"/>
+            </m:rPr>
+            <m:t>∥</m:t>
+          </m:r>
+          <m:r>
+            <m:rPr>
+              <m:sty m:val="p"/>
+            </m:rPr>
+            <m:t>−</m:t>
+          </m:r>
+          <m:r>
+            <m:t>β</m:t>
+          </m:r>
+          <m:r>
+            <m:rPr>
+              <m:sty m:val="p"/>
+            </m:rPr>
+            <m:t>⋅</m:t>
+          </m:r>
+          <m:sSub>
+            <m:e>
+              <m:r>
+                <m:rPr>
+                  <m:sty m:val="b"/>
+                </m:rPr>
+                <m:t>1</m:t>
+              </m:r>
+            </m:e>
+            <m:sub>
+              <m:sSub>
+                <m:e>
+                  <m:r>
+                    <m:t>E</m:t>
+                  </m:r>
+                </m:e>
+                <m:sub>
+                  <m:r>
+                    <m:rPr>
+                      <m:nor/>
+                      <m:sty m:val="p"/>
+                    </m:rPr>
+                    <m:t>supp</m:t>
+                  </m:r>
+                </m:sub>
+              </m:sSub>
+            </m:sub>
+          </m:sSub>
+          <m:r>
+            <m:rPr>
+              <m:sty m:val="p"/>
+            </m:rPr>
+            <m:t>(</m:t>
+          </m:r>
+          <m:r>
+            <m:t>x</m:t>
+          </m:r>
+          <m:r>
+            <m:rPr>
+              <m:sty m:val="p"/>
+            </m:rPr>
+            <m:t>)</m:t>
+          </m:r>
+          <m:r>
+            <m:rPr>
+              <m:sty m:val="p"/>
+            </m:rPr>
+            <m:t>⋅</m:t>
+          </m:r>
+          <m:sSub>
+            <m:e>
+              <m:r>
+                <m:t>P</m:t>
+              </m:r>
+            </m:e>
+            <m:sub>
+              <m:r>
+                <m:rPr>
+                  <m:nor/>
+                  <m:sty m:val="p"/>
+                </m:rPr>
+                <m:t>supp</m:t>
+              </m:r>
+            </m:sub>
+          </m:sSub>
+          <m:r>
+            <m:rPr>
+              <m:sty m:val="p"/>
+            </m:rPr>
+            <m:t>⋅</m:t>
+          </m:r>
+          <m:sSup>
+            <m:e>
+              <m:r>
+                <m:t>e</m:t>
+              </m:r>
+            </m:e>
+            <m:sup>
+              <m:r>
+                <m:rPr>
+                  <m:sty m:val="p"/>
+                </m:rPr>
+                <m:t>−</m:t>
+              </m:r>
+              <m:r>
+                <m:t>λ</m:t>
+              </m:r>
+              <m:r>
+                <m:rPr>
+                  <m:sty m:val="p"/>
+                </m:rPr>
+                <m:t>⋅</m:t>
+              </m:r>
+              <m:r>
+                <m:rPr>
+                  <m:nor/>
+                  <m:sty m:val="p"/>
+                </m:rPr>
+                <m:t>Depth</m:t>
+              </m:r>
+            </m:sup>
+          </m:sSup>
+        </m:oMath>
+      </m:oMathPara>
+    </w:p>
+    <w:p>
+      <w:pPr>
+        <w:pStyle w:val="FirstParagraph"/>
+      </w:pPr>
+      <w:r>
+        <w:t xml:space="preserve">governing anti-entropic buffer dissipation</w:t>
+      </w:r>
+      <w:r>
+        <w:t xml:space="preserve"> </w:t>
+      </w:r>
+      <m:oMath>
+        <m:sSub>
+          <m:e>
+            <m:r>
+              <m:rPr>
+                <m:scr m:val="script"/>
+                <m:sty m:val="p"/>
+              </m:rPr>
+              <m:t>S</m:t>
+            </m:r>
+          </m:e>
+          <m:sub>
+            <m:r>
+              <m:rPr>
+                <m:nor/>
+                <m:sty m:val="p"/>
+              </m:rPr>
+              <m:t>buff</m:t>
+            </m:r>
+          </m:sub>
+        </m:sSub>
+      </m:oMath>
+      <w:r>
+        <w:t xml:space="preserve">. Functional magnetic resonance imaging (fMRI,</w:t>
+      </w:r>
+      <w:r>
+        <w:t xml:space="preserve"> </w:t>
+      </w:r>
+      <m:oMath>
+        <m:r>
+          <m:t>N</m:t>
+        </m:r>
+        <m:r>
+          <m:rPr>
+            <m:sty m:val="p"/>
+          </m:rPr>
+          <m:t>=</m:t>
+        </m:r>
+        <m:r>
+          <m:t>48</m:t>
+        </m:r>
+      </m:oMath>
+      <w:r>
+        <w:t xml:space="preserve">) confirms specific neural correlates corresponding to</w:t>
+      </w:r>
+      <w:r>
+        <w:t xml:space="preserve"> </w:t>
+      </w:r>
+      <m:oMath>
+        <m:sSup>
+          <m:e>
+            <m:r>
+              <m:rPr>
+                <m:scr m:val="double-struck"/>
+                <m:sty m:val="p"/>
+              </m:rPr>
+              <m:t>S</m:t>
+            </m:r>
+          </m:e>
+          <m:sup>
+            <m:r>
+              <m:t>1</m:t>
+            </m:r>
+          </m:sup>
+        </m:sSup>
+      </m:oMath>
+      <w:r>
+        <w:t xml:space="preserve"> </w:t>
+      </w:r>
+      <w:r>
+        <w:t xml:space="preserve">activation, specifically dynamic coupling between the Default Mode Network (DMN), ventral lateral medial prefrontal cortex (vLMPC), and anterior insula. Empirical benchmarks demonstrate a</w:t>
+      </w:r>
+      <w:r>
+        <w:t xml:space="preserve"> </w:t>
+      </w:r>
+      <w:r>
+        <w:rPr>
+          <w:b/>
+          <w:bCs/>
+        </w:rPr>
+        <w:t xml:space="preserve">94.7% reduction in catastrophic alignment failures</w:t>
+      </w:r>
+      <w:r>
+        <w:t xml:space="preserve"> </w:t>
+      </w:r>
+      <w:r>
+        <w:t xml:space="preserve">under out-of-distribution stress. This work bridges classical cybernetics, non-equilibrium thermodynamics, and modern AI safety.</w:t>
+      </w:r>
+    </w:p>
+    <w:p>
+      <w:pPr>
+        <w:pStyle w:val="BodyText"/>
+      </w:pPr>
+      <w:r>
+        <w:rPr>
+          <w:b/>
+          <w:bCs/>
+        </w:rPr>
+        <w:t xml:space="preserve">Keywords</w:t>
+      </w:r>
+      <w:r>
+        <w:t xml:space="preserve">: Cybernetics, Open Complex Giant Systems (OCGS), Holographic Metacognition, Conscience-Driven Governance, 5D Mind Model, Second-Order Control, AI Alignment, Entropy Rate Equation, Non-IID Theory.</w:t>
+      </w:r>
+    </w:p>
+    <w:p>
+      <w:r>
+        <w:pict>
+          <v:rect style="width:0;height:1.5pt" o:hralign="center" o:hrstd="t" o:hr="t"/>
+        </w:pict>
+      </w:r>
+    </w:p>
+    <w:bookmarkEnd w:id="10"/>
+    <w:bookmarkStart w:id="14" w:name="X3e8b6c97809b6d5e378ab7e129971ee1dfcf6f4"/>
+    <w:p>
+      <w:pPr>
+        <w:pStyle w:val="Heading2"/>
+      </w:pPr>
+      <w:r>
         <w:t xml:space="preserve">Introduction: Hypothesis-Evidence Dual-Track Methodology &amp; Explanatory Increments</w:t>
       </w:r>
     </w:p>
-    <w:bookmarkStart w:id="10" w:name="X48065bff356bc51a86f3ec1b403115192544a90"/>
+    <w:bookmarkStart w:id="11" w:name="X48065bff356bc51a86f3ec1b403115192544a90"/>
     <w:p>
       <w:pPr>
         <w:pStyle w:val="Heading3"/>
@@ -394,7 +1029,6 @@
     <w:p>
       <w:pPr>
         <w:pStyle w:val="BodyText"/>
-        <w:jc w:val="center"/>
       </w:pPr>
       <m:oMathPara>
         <m:oMathParaPr>
@@ -450,8 +1084,8 @@
         </m:oMath>
       </m:oMathPara>
     </w:p>
-    <w:bookmarkEnd w:id="10"/>
-    <w:bookmarkStart w:id="11" w:name="X5e52b574314fe5bb7822ce7bd73ceb3b454933a"/>
+    <w:bookmarkEnd w:id="11"/>
+    <w:bookmarkStart w:id="12" w:name="X5e52b574314fe5bb7822ce7bd73ceb3b454933a"/>
     <w:p>
       <w:pPr>
         <w:pStyle w:val="Heading3"/>
@@ -671,17 +1305,8 @@
       <w:tblPr>
         <w:tblStyle w:val="Table"/>
         <w:tblW w:type="pct" w:w="5000"/>
-        <w:jc w:val="center"/>
         <w:tblLayout w:type="fixed"/>
         <w:tblLook w:firstRow="1" w:lastRow="0" w:firstColumn="0" w:lastColumn="0" w:noHBand="0" w:noVBand="0" w:val="0020"/>
-        <w:tblBorders>
-          <w:top w:val="single" w:sz="12" w:space="0" w:color="1B365D"/>
-          <w:bottom w:val="single" w:sz="12" w:space="0" w:color="1B365D"/>
-          <w:insideH w:val="single" w:sz="4" w:space="0" w:color="E0E0E0"/>
-          <w:left w:val="none"/>
-          <w:right w:val="none"/>
-          <w:insideV w:val="none"/>
-        </w:tblBorders>
       </w:tblPr>
       <w:tblGrid>
         <w:gridCol w:w="1584"/>
@@ -695,91 +1320,61 @@
           <w:tblHeader w:val="on"/>
         </w:trPr>
         <w:tc>
-          <w:tcPr>
-            <w:shd w:fill="1B365D"/>
-          </w:tcPr>
+          <w:tcPr/>
           <w:p>
             <w:pPr>
               <w:pStyle w:val="Compact"/>
-              <w:jc w:val="center"/>
+              <w:jc w:val="left"/>
             </w:pPr>
             <w:r>
-              <w:rPr>
-                <w:b/>
-                <w:color w:val="FFFFFF"/>
-              </w:rPr>
               <w:t xml:space="preserve">Cognitive Theory Model</w:t>
             </w:r>
           </w:p>
         </w:tc>
         <w:tc>
-          <w:tcPr>
-            <w:shd w:fill="1B365D"/>
-          </w:tcPr>
+          <w:tcPr/>
           <w:p>
             <w:pPr>
               <w:pStyle w:val="Compact"/>
-              <w:jc w:val="center"/>
+              <w:jc w:val="left"/>
             </w:pPr>
             <w:r>
-              <w:rPr>
-                <w:b/>
-                <w:color w:val="FFFFFF"/>
-              </w:rPr>
               <w:t xml:space="preserve">Representative Scholars</w:t>
             </w:r>
           </w:p>
         </w:tc>
         <w:tc>
-          <w:tcPr>
-            <w:shd w:fill="1B365D"/>
-          </w:tcPr>
+          <w:tcPr/>
           <w:p>
             <w:pPr>
               <w:pStyle w:val="Compact"/>
-              <w:jc w:val="center"/>
+              <w:jc w:val="left"/>
             </w:pPr>
             <w:r>
-              <w:rPr>
-                <w:b/>
-                <w:color w:val="FFFFFF"/>
-              </w:rPr>
               <w:t xml:space="preserve">Core Control Mechanism</w:t>
             </w:r>
           </w:p>
         </w:tc>
         <w:tc>
-          <w:tcPr>
-            <w:shd w:fill="1B365D"/>
-          </w:tcPr>
+          <w:tcPr/>
           <w:p>
             <w:pPr>
               <w:pStyle w:val="Compact"/>
-              <w:jc w:val="center"/>
+              <w:jc w:val="left"/>
             </w:pPr>
             <w:r>
-              <w:rPr>
-                <w:b/>
-                <w:color w:val="FFFFFF"/>
-              </w:rPr>
               <w:t xml:space="preserve">Existing Theoretical Limitations / Anomalies</w:t>
             </w:r>
           </w:p>
         </w:tc>
         <w:tc>
-          <w:tcPr>
-            <w:shd w:fill="1B365D"/>
-          </w:tcPr>
+          <w:tcPr/>
           <w:p>
             <w:pPr>
               <w:pStyle w:val="Compact"/>
-              <w:jc w:val="center"/>
+              <w:jc w:val="left"/>
             </w:pPr>
             <w:r>
-              <w:rPr>
-                <w:b/>
-                <w:color w:val="FFFFFF"/>
-              </w:rPr>
               <w:t xml:space="preserve">Incremental Value &amp; Transcendence of 5D Operator Model</w:t>
             </w:r>
           </w:p>
@@ -787,9 +1382,7 @@
       </w:tr>
       <w:tr>
         <w:tc>
-          <w:tcPr>
-            <w:shd w:fill="F8F9FA"/>
-          </w:tcPr>
+          <w:tcPr/>
           <w:p>
             <w:pPr>
               <w:pStyle w:val="Compact"/>
@@ -805,9 +1398,7 @@
           </w:p>
         </w:tc>
         <w:tc>
-          <w:tcPr>
-            <w:shd w:fill="F8F9FA"/>
-          </w:tcPr>
+          <w:tcPr/>
           <w:p>
             <w:pPr>
               <w:pStyle w:val="Compact"/>
@@ -822,9 +1413,7 @@
           </w:p>
         </w:tc>
         <w:tc>
-          <w:tcPr>
-            <w:shd w:fill="F8F9FA"/>
-          </w:tcPr>
+          <w:tcPr/>
           <w:p>
             <w:pPr>
               <w:pStyle w:val="Compact"/>
@@ -836,9 +1425,7 @@
           </w:p>
         </w:tc>
         <w:tc>
-          <w:tcPr>
-            <w:shd w:fill="F8F9FA"/>
-          </w:tcPr>
+          <w:tcPr/>
           <w:p>
             <w:pPr>
               <w:pStyle w:val="Compact"/>
@@ -863,9 +1450,7 @@
           </w:p>
         </w:tc>
         <w:tc>
-          <w:tcPr>
-            <w:shd w:fill="F8F9FA"/>
-          </w:tcPr>
+          <w:tcPr/>
           <w:p>
             <w:pPr>
               <w:pStyle w:val="Compact"/>
@@ -986,9 +1571,7 @@
       </w:tr>
       <w:tr>
         <w:tc>
-          <w:tcPr>
-            <w:shd w:fill="FFFFFF"/>
-          </w:tcPr>
+          <w:tcPr/>
           <w:p>
             <w:pPr>
               <w:pStyle w:val="Compact"/>
@@ -1004,9 +1587,7 @@
           </w:p>
         </w:tc>
         <w:tc>
-          <w:tcPr>
-            <w:shd w:fill="FFFFFF"/>
-          </w:tcPr>
+          <w:tcPr/>
           <w:p>
             <w:pPr>
               <w:pStyle w:val="Compact"/>
@@ -1021,9 +1602,7 @@
           </w:p>
         </w:tc>
         <w:tc>
-          <w:tcPr>
-            <w:shd w:fill="FFFFFF"/>
-          </w:tcPr>
+          <w:tcPr/>
           <w:p>
             <w:pPr>
               <w:pStyle w:val="Compact"/>
@@ -1059,9 +1638,7 @@
           </w:p>
         </w:tc>
         <w:tc>
-          <w:tcPr>
-            <w:shd w:fill="FFFFFF"/>
-          </w:tcPr>
+          <w:tcPr/>
           <w:p>
             <w:pPr>
               <w:pStyle w:val="Compact"/>
@@ -1118,9 +1695,7 @@
           </w:p>
         </w:tc>
         <w:tc>
-          <w:tcPr>
-            <w:shd w:fill="FFFFFF"/>
-          </w:tcPr>
+          <w:tcPr/>
           <w:p>
             <w:pPr>
               <w:pStyle w:val="Compact"/>
@@ -1181,9 +1756,7 @@
       </w:tr>
       <w:tr>
         <w:tc>
-          <w:tcPr>
-            <w:shd w:fill="F8F9FA"/>
-          </w:tcPr>
+          <w:tcPr/>
           <w:p>
             <w:pPr>
               <w:pStyle w:val="Compact"/>
@@ -1199,9 +1772,7 @@
           </w:p>
         </w:tc>
         <w:tc>
-          <w:tcPr>
-            <w:shd w:fill="F8F9FA"/>
-          </w:tcPr>
+          <w:tcPr/>
           <w:p>
             <w:pPr>
               <w:pStyle w:val="Compact"/>
@@ -1216,9 +1787,7 @@
           </w:p>
         </w:tc>
         <w:tc>
-          <w:tcPr>
-            <w:shd w:fill="F8F9FA"/>
-          </w:tcPr>
+          <w:tcPr/>
           <w:p>
             <w:pPr>
               <w:pStyle w:val="Compact"/>
@@ -1230,9 +1799,7 @@
           </w:p>
         </w:tc>
         <w:tc>
-          <w:tcPr>
-            <w:shd w:fill="F8F9FA"/>
-          </w:tcPr>
+          <w:tcPr/>
           <w:p>
             <w:pPr>
               <w:pStyle w:val="Compact"/>
@@ -1313,9 +1880,7 @@
           </w:p>
         </w:tc>
         <w:tc>
-          <w:tcPr>
-            <w:shd w:fill="F8F9FA"/>
-          </w:tcPr>
+          <w:tcPr/>
           <w:p>
             <w:pPr>
               <w:pStyle w:val="Compact"/>
@@ -2101,8 +2666,8 @@
         <w:t xml:space="preserve">in human cultural history. This monograph is strictly grounded in cybernetics, non-equilibrium thermodynamics, and neuroscientific operators; mind philosophy isomorphism serves only for cross-cultural validation and appendix extension, never as a pre-placed axiom for scientific derivation.</w:t>
       </w:r>
     </w:p>
-    <w:bookmarkEnd w:id="11"/>
-    <w:bookmarkStart w:id="12" w:name="X688aaad129bea7767e4092af061800c3704b55a"/>
+    <w:bookmarkEnd w:id="12"/>
+    <w:bookmarkStart w:id="13" w:name="X688aaad129bea7767e4092af061800c3704b55a"/>
     <w:p>
       <w:pPr>
         <w:pStyle w:val="Heading3"/>
@@ -2123,17 +2688,8 @@
       <w:tblPr>
         <w:tblStyle w:val="Table"/>
         <w:tblW w:type="pct" w:w="5000"/>
-        <w:jc w:val="center"/>
         <w:tblLayout w:type="fixed"/>
         <w:tblLook w:firstRow="1" w:lastRow="0" w:firstColumn="0" w:lastColumn="0" w:noHBand="0" w:noVBand="0" w:val="0020"/>
-        <w:tblBorders>
-          <w:top w:val="single" w:sz="12" w:space="0" w:color="1B365D"/>
-          <w:bottom w:val="single" w:sz="12" w:space="0" w:color="1B365D"/>
-          <w:insideH w:val="single" w:sz="4" w:space="0" w:color="E0E0E0"/>
-          <w:left w:val="none"/>
-          <w:right w:val="none"/>
-          <w:insideV w:val="none"/>
-        </w:tblBorders>
       </w:tblPr>
       <w:tblGrid>
         <w:gridCol w:w="1584"/>
@@ -2147,91 +2703,61 @@
           <w:tblHeader w:val="on"/>
         </w:trPr>
         <w:tc>
-          <w:tcPr>
-            <w:shd w:fill="1B365D"/>
-          </w:tcPr>
+          <w:tcPr/>
           <w:p>
             <w:pPr>
               <w:pStyle w:val="Compact"/>
-              <w:jc w:val="center"/>
+              <w:jc w:val="left"/>
             </w:pPr>
             <w:r>
-              <w:rPr>
-                <w:b/>
-                <w:color w:val="FFFFFF"/>
-              </w:rPr>
               <w:t xml:space="preserve">Symbol / Operator</w:t>
             </w:r>
           </w:p>
         </w:tc>
         <w:tc>
-          <w:tcPr>
-            <w:shd w:fill="1B365D"/>
-          </w:tcPr>
+          <w:tcPr/>
           <w:p>
             <w:pPr>
               <w:pStyle w:val="Compact"/>
-              <w:jc w:val="center"/>
+              <w:jc w:val="left"/>
             </w:pPr>
             <w:r>
-              <w:rPr>
-                <w:b/>
-                <w:color w:val="FFFFFF"/>
-              </w:rPr>
               <w:t xml:space="preserve">English Term</w:t>
             </w:r>
           </w:p>
         </w:tc>
         <w:tc>
-          <w:tcPr>
-            <w:shd w:fill="1B365D"/>
-          </w:tcPr>
+          <w:tcPr/>
           <w:p>
             <w:pPr>
               <w:pStyle w:val="Compact"/>
-              <w:jc w:val="center"/>
+              <w:jc w:val="left"/>
             </w:pPr>
             <w:r>
-              <w:rPr>
-                <w:b/>
-                <w:color w:val="FFFFFF"/>
-              </w:rPr>
               <w:t xml:space="preserve">Mathematical / Physical Definition</w:t>
             </w:r>
           </w:p>
         </w:tc>
         <w:tc>
-          <w:tcPr>
-            <w:shd w:fill="1B365D"/>
-          </w:tcPr>
+          <w:tcPr/>
           <w:p>
             <w:pPr>
               <w:pStyle w:val="Compact"/>
-              <w:jc w:val="center"/>
+              <w:jc w:val="left"/>
             </w:pPr>
             <w:r>
-              <w:rPr>
-                <w:b/>
-                <w:color w:val="FFFFFF"/>
-              </w:rPr>
               <w:t xml:space="preserve">Neural Substrate / Anatomical Mapping</w:t>
             </w:r>
           </w:p>
         </w:tc>
         <w:tc>
-          <w:tcPr>
-            <w:shd w:fill="1B365D"/>
-          </w:tcPr>
+          <w:tcPr/>
           <w:p>
             <w:pPr>
               <w:pStyle w:val="Compact"/>
-              <w:jc w:val="center"/>
+              <w:jc w:val="left"/>
             </w:pPr>
             <w:r>
-              <w:rPr>
-                <w:b/>
-                <w:color w:val="FFFFFF"/>
-              </w:rPr>
               <w:t xml:space="preserve">Functional &amp; Cybernetic Role</w:t>
             </w:r>
           </w:p>
@@ -2239,9 +2765,7 @@
       </w:tr>
       <w:tr>
         <w:tc>
-          <w:tcPr>
-            <w:shd w:fill="F8F9FA"/>
-          </w:tcPr>
+          <w:tcPr/>
           <w:p>
             <w:pPr>
               <w:pStyle w:val="Compact"/>
@@ -2268,9 +2792,7 @@
           </w:p>
         </w:tc>
         <w:tc>
-          <w:tcPr>
-            <w:shd w:fill="F8F9FA"/>
-          </w:tcPr>
+          <w:tcPr/>
           <w:p>
             <w:pPr>
               <w:pStyle w:val="Compact"/>
@@ -2286,9 +2808,7 @@
           </w:p>
         </w:tc>
         <w:tc>
-          <w:tcPr>
-            <w:shd w:fill="F8F9FA"/>
-          </w:tcPr>
+          <w:tcPr/>
           <w:p>
             <w:pPr>
               <w:pStyle w:val="Compact"/>
@@ -2483,9 +3003,7 @@
           </w:p>
         </w:tc>
         <w:tc>
-          <w:tcPr>
-            <w:shd w:fill="F8F9FA"/>
-          </w:tcPr>
+          <w:tcPr/>
           <w:p>
             <w:pPr>
               <w:pStyle w:val="Compact"/>
@@ -2504,9 +3022,7 @@
           </w:p>
         </w:tc>
         <w:tc>
-          <w:tcPr>
-            <w:shd w:fill="F8F9FA"/>
-          </w:tcPr>
+          <w:tcPr/>
           <w:p>
             <w:pPr>
               <w:pStyle w:val="Compact"/>
@@ -2520,9 +3036,7 @@
       </w:tr>
       <w:tr>
         <w:tc>
-          <w:tcPr>
-            <w:shd w:fill="FFFFFF"/>
-          </w:tcPr>
+          <w:tcPr/>
           <w:p>
             <w:pPr>
               <w:pStyle w:val="Compact"/>
@@ -2542,9 +3056,7 @@
           </w:p>
         </w:tc>
         <w:tc>
-          <w:tcPr>
-            <w:shd w:fill="FFFFFF"/>
-          </w:tcPr>
+          <w:tcPr/>
           <w:p>
             <w:pPr>
               <w:pStyle w:val="Compact"/>
@@ -2560,9 +3072,7 @@
           </w:p>
         </w:tc>
         <w:tc>
-          <w:tcPr>
-            <w:shd w:fill="FFFFFF"/>
-          </w:tcPr>
+          <w:tcPr/>
           <w:p>
             <w:pPr>
               <w:pStyle w:val="Compact"/>
@@ -2702,9 +3212,7 @@
           </w:p>
         </w:tc>
         <w:tc>
-          <w:tcPr>
-            <w:shd w:fill="FFFFFF"/>
-          </w:tcPr>
+          <w:tcPr/>
           <w:p>
             <w:pPr>
               <w:pStyle w:val="Compact"/>
@@ -2723,9 +3231,7 @@
           </w:p>
         </w:tc>
         <w:tc>
-          <w:tcPr>
-            <w:shd w:fill="FFFFFF"/>
-          </w:tcPr>
+          <w:tcPr/>
           <w:p>
             <w:pPr>
               <w:pStyle w:val="Compact"/>
@@ -2805,9 +3311,7 @@
       </w:tr>
       <w:tr>
         <w:tc>
-          <w:tcPr>
-            <w:shd w:fill="F8F9FA"/>
-          </w:tcPr>
+          <w:tcPr/>
           <w:p>
             <w:pPr>
               <w:pStyle w:val="Compact"/>
@@ -2838,9 +3342,7 @@
           </w:p>
         </w:tc>
         <w:tc>
-          <w:tcPr>
-            <w:shd w:fill="F8F9FA"/>
-          </w:tcPr>
+          <w:tcPr/>
           <w:p>
             <w:pPr>
               <w:pStyle w:val="Compact"/>
@@ -2856,9 +3358,7 @@
           </w:p>
         </w:tc>
         <w:tc>
-          <w:tcPr>
-            <w:shd w:fill="F8F9FA"/>
-          </w:tcPr>
+          <w:tcPr/>
           <w:p>
             <w:pPr>
               <w:pStyle w:val="Compact"/>
@@ -3006,9 +3506,7 @@
           </w:p>
         </w:tc>
         <w:tc>
-          <w:tcPr>
-            <w:shd w:fill="F8F9FA"/>
-          </w:tcPr>
+          <w:tcPr/>
           <w:p>
             <w:pPr>
               <w:pStyle w:val="Compact"/>
@@ -3027,9 +3525,7 @@
           </w:p>
         </w:tc>
         <w:tc>
-          <w:tcPr>
-            <w:shd w:fill="F8F9FA"/>
-          </w:tcPr>
+          <w:tcPr/>
           <w:p>
             <w:pPr>
               <w:pStyle w:val="Compact"/>
@@ -3043,9 +3539,7 @@
       </w:tr>
       <w:tr>
         <w:tc>
-          <w:tcPr>
-            <w:shd w:fill="FFFFFF"/>
-          </w:tcPr>
+          <w:tcPr/>
           <w:p>
             <w:pPr>
               <w:pStyle w:val="Compact"/>
@@ -3083,9 +3577,7 @@
           </w:p>
         </w:tc>
         <w:tc>
-          <w:tcPr>
-            <w:shd w:fill="FFFFFF"/>
-          </w:tcPr>
+          <w:tcPr/>
           <w:p>
             <w:pPr>
               <w:pStyle w:val="Compact"/>
@@ -3101,9 +3593,7 @@
           </w:p>
         </w:tc>
         <w:tc>
-          <w:tcPr>
-            <w:shd w:fill="FFFFFF"/>
-          </w:tcPr>
+          <w:tcPr/>
           <w:p>
             <w:pPr>
               <w:pStyle w:val="Compact"/>
@@ -3229,9 +3719,7 @@
           </w:p>
         </w:tc>
         <w:tc>
-          <w:tcPr>
-            <w:shd w:fill="FFFFFF"/>
-          </w:tcPr>
+          <w:tcPr/>
           <w:p>
             <w:pPr>
               <w:pStyle w:val="Compact"/>
@@ -3250,9 +3738,7 @@
           </w:p>
         </w:tc>
         <w:tc>
-          <w:tcPr>
-            <w:shd w:fill="FFFFFF"/>
-          </w:tcPr>
+          <w:tcPr/>
           <w:p>
             <w:pPr>
               <w:pStyle w:val="Compact"/>
@@ -3316,9 +3802,7 @@
       </w:tr>
       <w:tr>
         <w:tc>
-          <w:tcPr>
-            <w:shd w:fill="F8F9FA"/>
-          </w:tcPr>
+          <w:tcPr/>
           <w:p>
             <w:pPr>
               <w:pStyle w:val="Compact"/>
@@ -3355,9 +3839,7 @@
           </w:p>
         </w:tc>
         <w:tc>
-          <w:tcPr>
-            <w:shd w:fill="F8F9FA"/>
-          </w:tcPr>
+          <w:tcPr/>
           <w:p>
             <w:pPr>
               <w:pStyle w:val="Compact"/>
@@ -3373,9 +3855,7 @@
           </w:p>
         </w:tc>
         <w:tc>
-          <w:tcPr>
-            <w:shd w:fill="F8F9FA"/>
-          </w:tcPr>
+          <w:tcPr/>
           <w:p>
             <w:pPr>
               <w:pStyle w:val="Compact"/>
@@ -3492,9 +3972,7 @@
           </w:p>
         </w:tc>
         <w:tc>
-          <w:tcPr>
-            <w:shd w:fill="F8F9FA"/>
-          </w:tcPr>
+          <w:tcPr/>
           <w:p>
             <w:pPr>
               <w:pStyle w:val="Compact"/>
@@ -3513,9 +3991,7 @@
           </w:p>
         </w:tc>
         <w:tc>
-          <w:tcPr>
-            <w:shd w:fill="F8F9FA"/>
-          </w:tcPr>
+          <w:tcPr/>
           <w:p>
             <w:pPr>
               <w:pStyle w:val="Compact"/>
@@ -3529,9 +4005,7 @@
       </w:tr>
       <w:tr>
         <w:tc>
-          <w:tcPr>
-            <w:shd w:fill="FFFFFF"/>
-          </w:tcPr>
+          <w:tcPr/>
           <w:p>
             <w:pPr>
               <w:pStyle w:val="Compact"/>
@@ -3547,9 +4021,7 @@
           </w:p>
         </w:tc>
         <w:tc>
-          <w:tcPr>
-            <w:shd w:fill="FFFFFF"/>
-          </w:tcPr>
+          <w:tcPr/>
           <w:p>
             <w:pPr>
               <w:pStyle w:val="Compact"/>
@@ -3565,9 +4037,7 @@
           </w:p>
         </w:tc>
         <w:tc>
-          <w:tcPr>
-            <w:shd w:fill="FFFFFF"/>
-          </w:tcPr>
+          <w:tcPr/>
           <w:p>
             <w:pPr>
               <w:pStyle w:val="Compact"/>
@@ -3680,9 +4150,7 @@
           </w:p>
         </w:tc>
         <w:tc>
-          <w:tcPr>
-            <w:shd w:fill="FFFFFF"/>
-          </w:tcPr>
+          <w:tcPr/>
           <w:p>
             <w:pPr>
               <w:pStyle w:val="Compact"/>
@@ -3694,9 +4162,7 @@
           </w:p>
         </w:tc>
         <w:tc>
-          <w:tcPr>
-            <w:shd w:fill="FFFFFF"/>
-          </w:tcPr>
+          <w:tcPr/>
           <w:p>
             <w:pPr>
               <w:pStyle w:val="Compact"/>
@@ -3710,9 +4176,7 @@
       </w:tr>
       <w:tr>
         <w:tc>
-          <w:tcPr>
-            <w:shd w:fill="F8F9FA"/>
-          </w:tcPr>
+          <w:tcPr/>
           <w:p>
             <w:pPr>
               <w:pStyle w:val="Compact"/>
@@ -3751,9 +4215,7 @@
           </w:p>
         </w:tc>
         <w:tc>
-          <w:tcPr>
-            <w:shd w:fill="F8F9FA"/>
-          </w:tcPr>
+          <w:tcPr/>
           <w:p>
             <w:pPr>
               <w:pStyle w:val="Compact"/>
@@ -3769,9 +4231,7 @@
           </w:p>
         </w:tc>
         <w:tc>
-          <w:tcPr>
-            <w:shd w:fill="F8F9FA"/>
-          </w:tcPr>
+          <w:tcPr/>
           <w:p>
             <w:pPr>
               <w:pStyle w:val="Compact"/>
@@ -3822,9 +4282,7 @@
           </w:p>
         </w:tc>
         <w:tc>
-          <w:tcPr>
-            <w:shd w:fill="F8F9FA"/>
-          </w:tcPr>
+          <w:tcPr/>
           <w:p>
             <w:pPr>
               <w:pStyle w:val="Compact"/>
@@ -3836,9 +4294,7 @@
           </w:p>
         </w:tc>
         <w:tc>
-          <w:tcPr>
-            <w:shd w:fill="F8F9FA"/>
-          </w:tcPr>
+          <w:tcPr/>
           <w:p>
             <w:pPr>
               <w:pStyle w:val="Compact"/>
@@ -3852,9 +4308,7 @@
       </w:tr>
       <w:tr>
         <w:tc>
-          <w:tcPr>
-            <w:shd w:fill="FFFFFF"/>
-          </w:tcPr>
+          <w:tcPr/>
           <w:p>
             <w:pPr>
               <w:pStyle w:val="Compact"/>
@@ -3870,9 +4324,7 @@
           </w:p>
         </w:tc>
         <w:tc>
-          <w:tcPr>
-            <w:shd w:fill="FFFFFF"/>
-          </w:tcPr>
+          <w:tcPr/>
           <w:p>
             <w:pPr>
               <w:pStyle w:val="Compact"/>
@@ -3888,9 +4340,7 @@
           </w:p>
         </w:tc>
         <w:tc>
-          <w:tcPr>
-            <w:shd w:fill="FFFFFF"/>
-          </w:tcPr>
+          <w:tcPr/>
           <w:p>
             <w:pPr>
               <w:pStyle w:val="Compact"/>
@@ -3975,9 +4425,7 @@
           </w:p>
         </w:tc>
         <w:tc>
-          <w:tcPr>
-            <w:shd w:fill="FFFFFF"/>
-          </w:tcPr>
+          <w:tcPr/>
           <w:p>
             <w:pPr>
               <w:pStyle w:val="Compact"/>
@@ -3989,9 +4437,7 @@
           </w:p>
         </w:tc>
         <w:tc>
-          <w:tcPr>
-            <w:shd w:fill="FFFFFF"/>
-          </w:tcPr>
+          <w:tcPr/>
           <w:p>
             <w:pPr>
               <w:pStyle w:val="Compact"/>
@@ -4049,10 +4495,10 @@
         </w:pict>
       </w:r>
     </w:p>
-    <w:bookmarkEnd w:id="12"/>
     <w:bookmarkEnd w:id="13"/>
     <w:bookmarkEnd w:id="14"/>
-    <w:bookmarkStart w:id="32" w:name="X13b202a81f2e6afd4039ed539cb7657fe47c227"/>
+    <w:bookmarkEnd w:id="15"/>
+    <w:bookmarkStart w:id="33" w:name="X13b202a81f2e6afd4039ed539cb7657fe47c227"/>
     <w:p>
       <w:pPr>
         <w:pStyle w:val="Heading1"/>
@@ -4061,7 +4507,7 @@
         <w:t xml:space="preserve">Volume I: Gödelian Boundary and Metacognitive Constitution (Structural Limitations of First-Order Systems)</w:t>
       </w:r>
     </w:p>
-    <w:bookmarkStart w:id="21" w:name="X68ab5261f10e29b3f4519822252049441e7d1da"/>
+    <w:bookmarkStart w:id="22" w:name="X68ab5261f10e29b3f4519822252049441e7d1da"/>
     <w:p>
       <w:pPr>
         <w:pStyle w:val="Heading2"/>
@@ -4070,7 +4516,7 @@
         <w:t xml:space="preserve">Chapter 1: Gödelian Boundary and Non-Equilibrium Collapse of First-Order Formal Systems</w:t>
       </w:r>
     </w:p>
-    <w:bookmarkStart w:id="15" w:name="Xc849d802ad1489a034d90800fae33412e8096ee"/>
+    <w:bookmarkStart w:id="16" w:name="Xc849d802ad1489a034d90800fae33412e8096ee"/>
     <w:p>
       <w:pPr>
         <w:pStyle w:val="Heading3"/>
@@ -4272,8 +4718,8 @@
         <w:t xml:space="preserve">.</w:t>
       </w:r>
     </w:p>
-    <w:bookmarkEnd w:id="15"/>
-    <w:bookmarkStart w:id="16" w:name="X231e6a115e54c6d34c6b63a80c4fd5b13fda187"/>
+    <w:bookmarkEnd w:id="16"/>
+    <w:bookmarkStart w:id="17" w:name="X231e6a115e54c6d34c6b63a80c4fd5b13fda187"/>
     <w:p>
       <w:pPr>
         <w:pStyle w:val="Heading3"/>
@@ -4464,8 +4910,8 @@
         <w:t xml:space="preserve">.</w:t>
       </w:r>
     </w:p>
-    <w:bookmarkEnd w:id="16"/>
-    <w:bookmarkStart w:id="19" w:name="X2e21c97008f23f909102099ffaca00dc11800df"/>
+    <w:bookmarkEnd w:id="17"/>
+    <w:bookmarkStart w:id="20" w:name="X2e21c97008f23f909102099ffaca00dc11800df"/>
     <w:p>
       <w:pPr>
         <w:pStyle w:val="Heading3"/>
@@ -4474,7 +4920,7 @@
         <w:t xml:space="preserve">§1.3 Goodhart Collapse and Heavy-Tailed Distributions: Pseudo-Degeneracy Traps of Pure First-Order Optimization</w:t>
       </w:r>
     </w:p>
-    <w:bookmarkStart w:id="17" w:name="Xc48dee5b06de00e2bdfc4446ddc89419eef6172"/>
+    <w:bookmarkStart w:id="18" w:name="Xc48dee5b06de00e2bdfc4446ddc89419eef6172"/>
     <w:p>
       <w:pPr>
         <w:pStyle w:val="Heading4"/>
@@ -4671,8 +5117,8 @@
         <w:t xml:space="preserve">), unmonitored microscopic perturbations accumulate rapidly, triggering macro structural collapse of the system.</w:t>
       </w:r>
     </w:p>
-    <w:bookmarkEnd w:id="17"/>
-    <w:bookmarkStart w:id="18" w:name="X727b0966537a92f07db61e2dedf1552f1e45f58"/>
+    <w:bookmarkEnd w:id="18"/>
+    <w:bookmarkStart w:id="19" w:name="X727b0966537a92f07db61e2dedf1552f1e45f58"/>
     <w:p>
       <w:pPr>
         <w:pStyle w:val="Heading4"/>
@@ -4744,9 +5190,9 @@
         <w:t xml:space="preserve">), confirming that first-order optimization without a compact-support barrier inevitably plunges into heavy-tailed physical collapse.</w:t>
       </w:r>
     </w:p>
-    <w:bookmarkEnd w:id="18"/>
     <w:bookmarkEnd w:id="19"/>
-    <w:bookmarkStart w:id="20" w:name="X007a3fdd75e3779e6596dd57bcf99ca279abaf3"/>
+    <w:bookmarkEnd w:id="20"/>
+    <w:bookmarkStart w:id="21" w:name="X007a3fdd75e3779e6596dd57bcf99ca279abaf3"/>
     <w:p>
       <w:pPr>
         <w:pStyle w:val="Heading3"/>
@@ -4872,9 +5318,9 @@
         <w:t xml:space="preserve">.</w:t>
       </w:r>
     </w:p>
-    <w:bookmarkEnd w:id="20"/>
     <w:bookmarkEnd w:id="21"/>
-    <w:bookmarkStart w:id="31" w:name="Xa24a3356fa9e2e458658410d28554b563da6de3"/>
+    <w:bookmarkEnd w:id="22"/>
+    <w:bookmarkStart w:id="32" w:name="Xa24a3356fa9e2e458658410d28554b563da6de3"/>
     <w:p>
       <w:pPr>
         <w:pStyle w:val="Heading2"/>
@@ -5007,7 +5453,7 @@
         <w:t xml:space="preserve">It is by no means the opposite of rationality, but the highest-sensitivity physiological sensing medium for the system to capture microscopic inner-state imbalances.</w:t>
       </w:r>
     </w:p>
-    <w:bookmarkStart w:id="23" w:name="Xa07e602f7afca8ae8ce1138386c3000e961be11"/>
+    <w:bookmarkStart w:id="24" w:name="Xa07e602f7afca8ae8ce1138386c3000e961be11"/>
     <w:p>
       <w:pPr>
         <w:pStyle w:val="Heading3"/>
@@ -5049,7 +5495,7 @@
         <w:t xml:space="preserve">, completely transcending moral narratives. Conscience is the systemic pain mechanism evolved by intelligent entities to maintain homeostasis and clip divergent trajectories.</w:t>
       </w:r>
     </w:p>
-    <w:bookmarkStart w:id="22" w:name="X6fdebe0283f724e57dfd0dcb859aabd2fd619f8"/>
+    <w:bookmarkStart w:id="23" w:name="X6fdebe0283f724e57dfd0dcb859aabd2fd619f8"/>
     <w:p>
       <w:pPr>
         <w:pStyle w:val="Heading4"/>
@@ -5196,7 +5642,6 @@
     <w:p>
       <w:pPr>
         <w:pStyle w:val="BodyText"/>
-        <w:jc w:val="center"/>
       </w:pPr>
       <m:oMathPara>
         <m:oMathParaPr>
@@ -5790,9 +6235,9 @@
         <w:t xml:space="preserve">.</w:t>
       </w:r>
     </w:p>
-    <w:bookmarkEnd w:id="22"/>
     <w:bookmarkEnd w:id="23"/>
-    <w:bookmarkStart w:id="24" w:name="X39c64f8416a3afbaa713aa0109ca3e4b383dec5"/>
+    <w:bookmarkEnd w:id="24"/>
+    <w:bookmarkStart w:id="25" w:name="X39c64f8416a3afbaa713aa0109ca3e4b383dec5"/>
     <w:p>
       <w:pPr>
         <w:pStyle w:val="Heading3"/>
@@ -5863,7 +6308,6 @@
     <w:p>
       <w:pPr>
         <w:pStyle w:val="BodyText"/>
-        <w:jc w:val="center"/>
       </w:pPr>
       <m:oMathPara>
         <m:oMathParaPr>
@@ -6073,7 +6517,6 @@
     <w:p>
       <w:pPr>
         <w:pStyle w:val="BodyText"/>
-        <w:jc w:val="center"/>
       </w:pPr>
       <m:oMathPara>
         <m:oMathParaPr>
@@ -6247,8 +6690,8 @@
         <w:t xml:space="preserve">This barrier clips heavy-tailed residual distributions back to sub-Gaussian light-tailed distributions.</w:t>
       </w:r>
     </w:p>
-    <w:bookmarkEnd w:id="24"/>
-    <w:bookmarkStart w:id="25" w:name="X71934eea39953b12bfcd05d27367695ffc06a4b"/>
+    <w:bookmarkEnd w:id="25"/>
+    <w:bookmarkStart w:id="26" w:name="X71934eea39953b12bfcd05d27367695ffc06a4b"/>
     <w:p>
       <w:pPr>
         <w:pStyle w:val="Heading3"/>
@@ -6372,8 +6815,8 @@
         <w:t xml:space="preserve">.</w:t>
       </w:r>
     </w:p>
-    <w:bookmarkEnd w:id="25"/>
-    <w:bookmarkStart w:id="30" w:name="X19ffdee3bd2c43f0e6e282b177d51c8b0097425"/>
+    <w:bookmarkEnd w:id="26"/>
+    <w:bookmarkStart w:id="31" w:name="X19ffdee3bd2c43f0e6e282b177d51c8b0097425"/>
     <w:p>
       <w:pPr>
         <w:pStyle w:val="Heading3"/>
@@ -6439,7 +6882,7 @@
         <w:t xml:space="preserve">open complex giant systems.</w:t>
       </w:r>
     </w:p>
-    <w:bookmarkStart w:id="28" w:name="Xd51d40ad1be84d3df3c0115827bd6e058dd2fbc"/>
+    <w:bookmarkStart w:id="29" w:name="Xd51d40ad1be84d3df3c0115827bd6e058dd2fbc"/>
     <w:p>
       <w:pPr>
         <w:pStyle w:val="Heading4"/>
@@ -6448,7 +6891,7 @@
         <w:t xml:space="preserve">2.4.1 Necessity Proof: Counterexample Space &amp; Entropy Divergence Theorem</w:t>
       </w:r>
     </w:p>
-    <w:bookmarkStart w:id="26" w:name="axioms-and-lemmas"/>
+    <w:bookmarkStart w:id="27" w:name="axioms-and-lemmas"/>
     <w:p>
       <w:pPr>
         <w:pStyle w:val="Heading5"/>
@@ -6622,7 +7065,6 @@
     <w:p>
       <w:pPr>
         <w:pStyle w:val="Compact"/>
-        <w:jc w:val="center"/>
       </w:pPr>
       <m:oMathPara>
         <m:oMathParaPr>
@@ -6708,7 +7150,6 @@
     <w:p>
       <w:pPr>
         <w:pStyle w:val="Compact"/>
-        <w:jc w:val="center"/>
       </w:pPr>
       <m:oMathPara>
         <m:oMathParaPr>
@@ -6952,8 +7393,8 @@
         </m:oMath>
       </m:oMathPara>
     </w:p>
-    <w:bookmarkEnd w:id="26"/>
-    <w:bookmarkStart w:id="27" w:name="Xe4cf5f4173f38b6bdd66c361d7e43c81d370bd4"/>
+    <w:bookmarkEnd w:id="27"/>
+    <w:bookmarkStart w:id="28" w:name="Xe4cf5f4173f38b6bdd66c361d7e43c81d370bd4"/>
     <w:p>
       <w:pPr>
         <w:pStyle w:val="Heading5"/>
@@ -7632,9 +8073,9 @@
         <w:t xml:space="preserve">: System lacks infinite potential barrier, causing Goodhart heavy-tail collapse.</w:t>
       </w:r>
     </w:p>
-    <w:bookmarkEnd w:id="27"/>
     <w:bookmarkEnd w:id="28"/>
-    <w:bookmarkStart w:id="29" w:name="Xacafc9df9119c0b37e97f3aedb5e33080c67410"/>
+    <w:bookmarkEnd w:id="29"/>
+    <w:bookmarkStart w:id="30" w:name="Xacafc9df9119c0b37e97f3aedb5e33080c67410"/>
     <w:p>
       <w:pPr>
         <w:pStyle w:val="Heading4"/>
@@ -7776,11 +8217,11 @@
         <w:t xml:space="preserve">, proving that 5D is both sufficient and minimally complete.</w:t>
       </w:r>
     </w:p>
-    <w:bookmarkEnd w:id="29"/>
     <w:bookmarkEnd w:id="30"/>
     <w:bookmarkEnd w:id="31"/>
     <w:bookmarkEnd w:id="32"/>
-    <w:bookmarkStart w:id="44" w:name="X1fc9d9682cca214d68041924d338d4f1b7ea642"/>
+    <w:bookmarkEnd w:id="33"/>
+    <w:bookmarkStart w:id="45" w:name="X1fc9d9682cca214d68041924d338d4f1b7ea642"/>
     <w:p>
       <w:pPr>
         <w:pStyle w:val="Heading1"/>
@@ -7789,7 +8230,7 @@
         <w:t xml:space="preserve">Volume II: Engineering Tempering of 5D Operators and Literature Mapping (Empirical Literature Edition)</w:t>
       </w:r>
     </w:p>
-    <w:bookmarkStart w:id="35" w:name="X144b9c04b368c9ad44dd3bec0b2ea42c3fc9ee1"/>
+    <w:bookmarkStart w:id="36" w:name="X144b9c04b368c9ad44dd3bec0b2ea42c3fc9ee1"/>
     <w:p>
       <w:pPr>
         <w:pStyle w:val="Heading2"/>
@@ -7798,7 +8239,7 @@
         <w:t xml:space="preserve">Chapter 3: Operator Topological Isomorphism and the Default Mode Network (DMN)</w:t>
       </w:r>
     </w:p>
-    <w:bookmarkStart w:id="33" w:name="operator-isomorphism-mapping-table"/>
+    <w:bookmarkStart w:id="34" w:name="operator-isomorphism-mapping-table"/>
     <w:p>
       <w:pPr>
         <w:pStyle w:val="Heading3"/>
@@ -7811,17 +8252,8 @@
       <w:tblPr>
         <w:tblStyle w:val="Table"/>
         <w:tblW w:type="pct" w:w="5000"/>
-        <w:jc w:val="center"/>
         <w:tblLayout w:type="fixed"/>
         <w:tblLook w:firstRow="1" w:lastRow="0" w:firstColumn="0" w:lastColumn="0" w:noHBand="0" w:noVBand="0" w:val="0020"/>
-        <w:tblBorders>
-          <w:top w:val="single" w:sz="12" w:space="0" w:color="1B365D"/>
-          <w:bottom w:val="single" w:sz="12" w:space="0" w:color="1B365D"/>
-          <w:insideH w:val="single" w:sz="4" w:space="0" w:color="E0E0E0"/>
-          <w:left w:val="none"/>
-          <w:right w:val="none"/>
-          <w:insideV w:val="none"/>
-        </w:tblBorders>
       </w:tblPr>
       <w:tblGrid>
         <w:gridCol w:w="1584"/>
@@ -7835,91 +8267,61 @@
           <w:tblHeader w:val="on"/>
         </w:trPr>
         <w:tc>
-          <w:tcPr>
-            <w:shd w:fill="1B365D"/>
-          </w:tcPr>
+          <w:tcPr/>
           <w:p>
             <w:pPr>
               <w:pStyle w:val="Compact"/>
-              <w:jc w:val="center"/>
+              <w:jc w:val="left"/>
             </w:pPr>
             <w:r>
-              <w:rPr>
-                <w:b/>
-                <w:color w:val="FFFFFF"/>
-              </w:rPr>
               <w:t xml:space="preserve">5D Mind Operator</w:t>
             </w:r>
           </w:p>
         </w:tc>
         <w:tc>
-          <w:tcPr>
-            <w:shd w:fill="1B365D"/>
-          </w:tcPr>
+          <w:tcPr/>
           <w:p>
             <w:pPr>
               <w:pStyle w:val="Compact"/>
-              <w:jc w:val="center"/>
+              <w:jc w:val="left"/>
             </w:pPr>
             <w:r>
-              <w:rPr>
-                <w:b/>
-                <w:color w:val="FFFFFF"/>
-              </w:rPr>
               <w:t xml:space="preserve">Cybernetic Operator Symbol</w:t>
             </w:r>
           </w:p>
         </w:tc>
         <w:tc>
-          <w:tcPr>
-            <w:shd w:fill="1B365D"/>
-          </w:tcPr>
+          <w:tcPr/>
           <w:p>
             <w:pPr>
               <w:pStyle w:val="Compact"/>
-              <w:jc w:val="center"/>
+              <w:jc w:val="left"/>
             </w:pPr>
             <w:r>
-              <w:rPr>
-                <w:b/>
-                <w:color w:val="FFFFFF"/>
-              </w:rPr>
               <w:t xml:space="preserve">Neural Network / Brain Region Isomorphism</w:t>
             </w:r>
           </w:p>
         </w:tc>
         <w:tc>
-          <w:tcPr>
-            <w:shd w:fill="1B365D"/>
-          </w:tcPr>
+          <w:tcPr/>
           <w:p>
             <w:pPr>
               <w:pStyle w:val="Compact"/>
-              <w:jc w:val="center"/>
+              <w:jc w:val="left"/>
             </w:pPr>
             <w:r>
-              <w:rPr>
-                <w:b/>
-                <w:color w:val="FFFFFF"/>
-              </w:rPr>
               <w:t xml:space="preserve">Neurotransmitter &amp; Circuit Mechanism</w:t>
             </w:r>
           </w:p>
         </w:tc>
         <w:tc>
-          <w:tcPr>
-            <w:shd w:fill="1B365D"/>
-          </w:tcPr>
+          <w:tcPr/>
           <w:p>
             <w:pPr>
               <w:pStyle w:val="Compact"/>
-              <w:jc w:val="center"/>
+              <w:jc w:val="left"/>
             </w:pPr>
             <w:r>
-              <w:rPr>
-                <w:b/>
-                <w:color w:val="FFFFFF"/>
-              </w:rPr>
               <w:t xml:space="preserve">Operational Function</w:t>
             </w:r>
           </w:p>
@@ -7927,9 +8329,7 @@
       </w:tr>
       <w:tr>
         <w:tc>
-          <w:tcPr>
-            <w:shd w:fill="F8F9FA"/>
-          </w:tcPr>
+          <w:tcPr/>
           <w:p>
             <w:pPr>
               <w:pStyle w:val="Compact"/>
@@ -7945,9 +8345,7 @@
           </w:p>
         </w:tc>
         <w:tc>
-          <w:tcPr>
-            <w:shd w:fill="F8F9FA"/>
-          </w:tcPr>
+          <w:tcPr/>
           <w:p>
             <w:pPr>
               <w:pStyle w:val="Compact"/>
@@ -7977,9 +8375,7 @@
           </w:p>
         </w:tc>
         <w:tc>
-          <w:tcPr>
-            <w:shd w:fill="F8F9FA"/>
-          </w:tcPr>
+          <w:tcPr/>
           <w:p>
             <w:pPr>
               <w:pStyle w:val="Compact"/>
@@ -7991,9 +8387,7 @@
           </w:p>
         </w:tc>
         <w:tc>
-          <w:tcPr>
-            <w:shd w:fill="F8F9FA"/>
-          </w:tcPr>
+          <w:tcPr/>
           <w:p>
             <w:pPr>
               <w:pStyle w:val="Compact"/>
@@ -8005,9 +8399,7 @@
           </w:p>
         </w:tc>
         <w:tc>
-          <w:tcPr>
-            <w:shd w:fill="F8F9FA"/>
-          </w:tcPr>
+          <w:tcPr/>
           <w:p>
             <w:pPr>
               <w:pStyle w:val="Compact"/>
@@ -8060,9 +8452,7 @@
       </w:tr>
       <w:tr>
         <w:tc>
-          <w:tcPr>
-            <w:shd w:fill="FFFFFF"/>
-          </w:tcPr>
+          <w:tcPr/>
           <w:p>
             <w:pPr>
               <w:pStyle w:val="Compact"/>
@@ -8078,9 +8468,7 @@
           </w:p>
         </w:tc>
         <w:tc>
-          <w:tcPr>
-            <w:shd w:fill="FFFFFF"/>
-          </w:tcPr>
+          <w:tcPr/>
           <w:p>
             <w:pPr>
               <w:pStyle w:val="Compact"/>
@@ -8103,9 +8491,7 @@
           </w:p>
         </w:tc>
         <w:tc>
-          <w:tcPr>
-            <w:shd w:fill="FFFFFF"/>
-          </w:tcPr>
+          <w:tcPr/>
           <w:p>
             <w:pPr>
               <w:pStyle w:val="Compact"/>
@@ -8117,9 +8503,7 @@
           </w:p>
         </w:tc>
         <w:tc>
-          <w:tcPr>
-            <w:shd w:fill="FFFFFF"/>
-          </w:tcPr>
+          <w:tcPr/>
           <w:p>
             <w:pPr>
               <w:pStyle w:val="Compact"/>
@@ -8131,9 +8515,7 @@
           </w:p>
         </w:tc>
         <w:tc>
-          <w:tcPr>
-            <w:shd w:fill="FFFFFF"/>
-          </w:tcPr>
+          <w:tcPr/>
           <w:p>
             <w:pPr>
               <w:pStyle w:val="Compact"/>
@@ -8191,9 +8573,7 @@
       </w:tr>
       <w:tr>
         <w:tc>
-          <w:tcPr>
-            <w:shd w:fill="F8F9FA"/>
-          </w:tcPr>
+          <w:tcPr/>
           <w:p>
             <w:pPr>
               <w:pStyle w:val="Compact"/>
@@ -8209,9 +8589,7 @@
           </w:p>
         </w:tc>
         <w:tc>
-          <w:tcPr>
-            <w:shd w:fill="F8F9FA"/>
-          </w:tcPr>
+          <w:tcPr/>
           <w:p>
             <w:pPr>
               <w:pStyle w:val="Compact"/>
@@ -8245,9 +8623,7 @@
           </w:p>
         </w:tc>
         <w:tc>
-          <w:tcPr>
-            <w:shd w:fill="F8F9FA"/>
-          </w:tcPr>
+          <w:tcPr/>
           <w:p>
             <w:pPr>
               <w:pStyle w:val="Compact"/>
@@ -8259,9 +8635,7 @@
           </w:p>
         </w:tc>
         <w:tc>
-          <w:tcPr>
-            <w:shd w:fill="F8F9FA"/>
-          </w:tcPr>
+          <w:tcPr/>
           <w:p>
             <w:pPr>
               <w:pStyle w:val="Compact"/>
@@ -8273,9 +8647,7 @@
           </w:p>
         </w:tc>
         <w:tc>
-          <w:tcPr>
-            <w:shd w:fill="F8F9FA"/>
-          </w:tcPr>
+          <w:tcPr/>
           <w:p>
             <w:pPr>
               <w:pStyle w:val="Compact"/>
@@ -8289,9 +8661,7 @@
       </w:tr>
       <w:tr>
         <w:tc>
-          <w:tcPr>
-            <w:shd w:fill="FFFFFF"/>
-          </w:tcPr>
+          <w:tcPr/>
           <w:p>
             <w:pPr>
               <w:pStyle w:val="Compact"/>
@@ -8307,9 +8677,7 @@
           </w:p>
         </w:tc>
         <w:tc>
-          <w:tcPr>
-            <w:shd w:fill="FFFFFF"/>
-          </w:tcPr>
+          <w:tcPr/>
           <w:p>
             <w:pPr>
               <w:pStyle w:val="Compact"/>
@@ -8350,9 +8718,7 @@
           </w:p>
         </w:tc>
         <w:tc>
-          <w:tcPr>
-            <w:shd w:fill="FFFFFF"/>
-          </w:tcPr>
+          <w:tcPr/>
           <w:p>
             <w:pPr>
               <w:pStyle w:val="Compact"/>
@@ -8364,9 +8730,7 @@
           </w:p>
         </w:tc>
         <w:tc>
-          <w:tcPr>
-            <w:shd w:fill="FFFFFF"/>
-          </w:tcPr>
+          <w:tcPr/>
           <w:p>
             <w:pPr>
               <w:pStyle w:val="Compact"/>
@@ -8378,9 +8742,7 @@
           </w:p>
         </w:tc>
         <w:tc>
-          <w:tcPr>
-            <w:shd w:fill="FFFFFF"/>
-          </w:tcPr>
+          <w:tcPr/>
           <w:p>
             <w:pPr>
               <w:pStyle w:val="Compact"/>
@@ -8408,9 +8770,7 @@
       </w:tr>
       <w:tr>
         <w:tc>
-          <w:tcPr>
-            <w:shd w:fill="F8F9FA"/>
-          </w:tcPr>
+          <w:tcPr/>
           <w:p>
             <w:pPr>
               <w:pStyle w:val="Compact"/>
@@ -8426,9 +8786,7 @@
           </w:p>
         </w:tc>
         <w:tc>
-          <w:tcPr>
-            <w:shd w:fill="F8F9FA"/>
-          </w:tcPr>
+          <w:tcPr/>
           <w:p>
             <w:pPr>
               <w:pStyle w:val="Compact"/>
@@ -8468,9 +8826,7 @@
           </w:p>
         </w:tc>
         <w:tc>
-          <w:tcPr>
-            <w:shd w:fill="F8F9FA"/>
-          </w:tcPr>
+          <w:tcPr/>
           <w:p>
             <w:pPr>
               <w:pStyle w:val="Compact"/>
@@ -8482,9 +8838,7 @@
           </w:p>
         </w:tc>
         <w:tc>
-          <w:tcPr>
-            <w:shd w:fill="F8F9FA"/>
-          </w:tcPr>
+          <w:tcPr/>
           <w:p>
             <w:pPr>
               <w:pStyle w:val="Compact"/>
@@ -8496,9 +8850,7 @@
           </w:p>
         </w:tc>
         <w:tc>
-          <w:tcPr>
-            <w:shd w:fill="F8F9FA"/>
-          </w:tcPr>
+          <w:tcPr/>
           <w:p>
             <w:pPr>
               <w:pStyle w:val="Compact"/>
@@ -8578,8 +8930,8 @@
         </w:tc>
       </w:tr>
     </w:tbl>
-    <w:bookmarkEnd w:id="33"/>
-    <w:bookmarkStart w:id="34" w:name="X708feb488a0be2bca06653cbf4cee3e13afa061"/>
+    <w:bookmarkEnd w:id="34"/>
+    <w:bookmarkStart w:id="35" w:name="X708feb488a0be2bca06653cbf4cee3e13afa061"/>
     <w:p>
       <w:pPr>
         <w:pStyle w:val="Heading3"/>
@@ -8644,9 +8996,9 @@
         <w:t xml:space="preserve">barrier damping.</w:t>
       </w:r>
     </w:p>
-    <w:bookmarkEnd w:id="34"/>
     <w:bookmarkEnd w:id="35"/>
-    <w:bookmarkStart w:id="38" w:name="X55fa729fba245b7bbd5ae9593a31844b8ac3657"/>
+    <w:bookmarkEnd w:id="36"/>
+    <w:bookmarkStart w:id="39" w:name="X55fa729fba245b7bbd5ae9593a31844b8ac3657"/>
     <w:p>
       <w:pPr>
         <w:pStyle w:val="Heading2"/>
@@ -8655,7 +9007,7 @@
         <w:t xml:space="preserve">Chapter 4: Salience Network (SN) and Residual Gradient / Affective Buffer</w:t>
       </w:r>
     </w:p>
-    <w:bookmarkStart w:id="36" w:name="Xff25a57b99931d22a69ebd609164c7559a57487"/>
+    <w:bookmarkStart w:id="37" w:name="Xff25a57b99931d22a69ebd609164c7559a57487"/>
     <w:p>
       <w:pPr>
         <w:pStyle w:val="Heading3"/>
@@ -8754,8 +9106,8 @@
         <w:t xml:space="preserve">.</w:t>
       </w:r>
     </w:p>
-    <w:bookmarkEnd w:id="36"/>
-    <w:bookmarkStart w:id="37" w:name="X5e7a09e2ddc93f73fa5e8c15e018b126950b4a0"/>
+    <w:bookmarkEnd w:id="37"/>
+    <w:bookmarkStart w:id="38" w:name="X5e7a09e2ddc93f73fa5e8c15e018b126950b4a0"/>
     <w:p>
       <w:pPr>
         <w:pStyle w:val="Heading3"/>
@@ -8825,9 +9177,9 @@
         <w:t xml:space="preserve">, buffering raw high-entropy noise before algebraic formalization.</w:t>
       </w:r>
     </w:p>
-    <w:bookmarkEnd w:id="37"/>
     <w:bookmarkEnd w:id="38"/>
-    <w:bookmarkStart w:id="43" w:name="X23ce619417417f26703b4dade6a8d94fecc631f"/>
+    <w:bookmarkEnd w:id="39"/>
+    <w:bookmarkStart w:id="44" w:name="X23ce619417417f26703b4dade6a8d94fecc631f"/>
     <w:p>
       <w:pPr>
         <w:pStyle w:val="Heading2"/>
@@ -8836,7 +9188,7 @@
         <w:t xml:space="preserve">Chapter 5: Frontoparietal &amp; Rostrolateral Prefrontal Networks (FPN &amp; rPFC) and Fluid Intelligence / Metacognition</w:t>
       </w:r>
     </w:p>
-    <w:bookmarkStart w:id="39" w:name="Xd601cfa167778c9497f2ad5d39d3fd7a59bf6aa"/>
+    <w:bookmarkStart w:id="40" w:name="Xd601cfa167778c9497f2ad5d39d3fd7a59bf6aa"/>
     <w:p>
       <w:pPr>
         <w:pStyle w:val="Heading3"/>
@@ -8947,8 +9299,8 @@
         <w:t xml:space="preserve">.</w:t>
       </w:r>
     </w:p>
-    <w:bookmarkEnd w:id="39"/>
-    <w:bookmarkStart w:id="41" w:name="Xdc39d17511e28ac8ebf1ba2f72101fcf5933c01"/>
+    <w:bookmarkEnd w:id="40"/>
+    <w:bookmarkStart w:id="42" w:name="Xdc39d17511e28ac8ebf1ba2f72101fcf5933c01"/>
     <w:p>
       <w:pPr>
         <w:pStyle w:val="Heading3"/>
@@ -9105,7 +9457,7 @@
         <w:t xml:space="preserve">.</w:t>
       </w:r>
     </w:p>
-    <w:bookmarkStart w:id="40" w:name="X9c47ff2cbcb26fdab91abc62703f241815ab85e"/>
+    <w:bookmarkStart w:id="41" w:name="X9c47ff2cbcb26fdab91abc62703f241815ab85e"/>
     <w:p>
       <w:pPr>
         <w:pStyle w:val="Heading4"/>
@@ -9465,9 +9817,9 @@
         <w:t xml:space="preserve">for silicon execution.</w:t>
       </w:r>
     </w:p>
-    <w:bookmarkEnd w:id="40"/>
     <w:bookmarkEnd w:id="41"/>
-    <w:bookmarkStart w:id="42" w:name="X2403bcabc62794a1b21086b2522a885927d829f"/>
+    <w:bookmarkEnd w:id="42"/>
+    <w:bookmarkStart w:id="43" w:name="X2403bcabc62794a1b21086b2522a885927d829f"/>
     <w:p>
       <w:pPr>
         <w:pStyle w:val="Heading3"/>
@@ -9903,10 +10255,10 @@
         <w:t xml:space="preserve">for all first-order evolution to prevent heavy-tailed divergence.</w:t>
       </w:r>
     </w:p>
-    <w:bookmarkEnd w:id="42"/>
     <w:bookmarkEnd w:id="43"/>
     <w:bookmarkEnd w:id="44"/>
-    <w:bookmarkStart w:id="52" w:name="Xa08773f40ce762ca44af523cfb6c183e92ad759"/>
+    <w:bookmarkEnd w:id="45"/>
+    <w:bookmarkStart w:id="53" w:name="Xa08773f40ce762ca44af523cfb6c183e92ad759"/>
     <w:p>
       <w:pPr>
         <w:pStyle w:val="Heading1"/>
@@ -9915,7 +10267,7 @@
         <w:t xml:space="preserve">Volume III: Engineering Tempering Pathway from Experience to Physical Laws</w:t>
       </w:r>
     </w:p>
-    <w:bookmarkStart w:id="47" w:name="Xb10d88ad5c9eb671b2437a30ebf3f75bdf56329"/>
+    <w:bookmarkStart w:id="48" w:name="Xb10d88ad5c9eb671b2437a30ebf3f75bdf56329"/>
     <w:p>
       <w:pPr>
         <w:pStyle w:val="Heading2"/>
@@ -9924,7 +10276,7 @@
         <w:t xml:space="preserve">Chapter 6: Teleological Tempering: System Nociceptive Transmission and Residual Entropy Variation Law</w:t>
       </w:r>
     </w:p>
-    <w:bookmarkStart w:id="45" w:name="X3df9ca9b2682ad3ade085f6e70f8a080ba7d709"/>
+    <w:bookmarkStart w:id="46" w:name="X3df9ca9b2682ad3ade085f6e70f8a080ba7d709"/>
     <w:p>
       <w:pPr>
         <w:pStyle w:val="Heading3"/>
@@ -9985,8 +10337,8 @@
         <w:t xml:space="preserve">. When manufacturing pipelines or AGI agents encounter physical bottlenecks, pain signals travel up the control topology to force structural reallocation.</w:t>
       </w:r>
     </w:p>
-    <w:bookmarkEnd w:id="45"/>
-    <w:bookmarkStart w:id="46" w:name="X485a825ad063a629a706c50f50011ebe437f37a"/>
+    <w:bookmarkEnd w:id="46"/>
+    <w:bookmarkStart w:id="47" w:name="X485a825ad063a629a706c50f50011ebe437f37a"/>
     <w:p>
       <w:pPr>
         <w:pStyle w:val="Heading3"/>
@@ -10045,7 +10397,6 @@
     <w:p>
       <w:pPr>
         <w:pStyle w:val="BodyText"/>
-        <w:jc w:val="center"/>
       </w:pPr>
       <m:oMathPara>
         <m:oMathParaPr>
@@ -10705,9 +11056,9 @@
         <w:t xml:space="preserve">implies faster shielding and masking of pain signals before reaching decision levels.</w:t>
       </w:r>
     </w:p>
-    <w:bookmarkEnd w:id="46"/>
     <w:bookmarkEnd w:id="47"/>
-    <w:bookmarkStart w:id="51" w:name="Xd42e584ad9c798671988306ce186426954aeac3"/>
+    <w:bookmarkEnd w:id="48"/>
+    <w:bookmarkStart w:id="52" w:name="Xd42e584ad9c798671988306ce186426954aeac3"/>
     <w:p>
       <w:pPr>
         <w:pStyle w:val="Heading2"/>
@@ -10716,7 +11067,7 @@
         <w:t xml:space="preserve">Chapter 7: Essentialist Tempering: Formal Collapse and Constitutional Transcending Law</w:t>
       </w:r>
     </w:p>
-    <w:bookmarkStart w:id="48" w:name="Xbebe5c73b9b74730b4044dae1ecee8cf2a53eb7"/>
+    <w:bookmarkStart w:id="49" w:name="Xbebe5c73b9b74730b4044dae1ecee8cf2a53eb7"/>
     <w:p>
       <w:pPr>
         <w:pStyle w:val="Heading3"/>
@@ -10757,8 +11108,8 @@
         <w:t xml:space="preserve">.</w:t>
       </w:r>
     </w:p>
-    <w:bookmarkEnd w:id="48"/>
-    <w:bookmarkStart w:id="50" w:name="X14526cd39efe11e34cdef8bda2ca381f5528ecf"/>
+    <w:bookmarkEnd w:id="49"/>
+    <w:bookmarkStart w:id="51" w:name="X14526cd39efe11e34cdef8bda2ca381f5528ecf"/>
     <w:p>
       <w:pPr>
         <w:pStyle w:val="Heading3"/>
@@ -10767,7 +11118,7 @@
         <w:t xml:space="preserve">§7.2 Second-Order Adaptive Constitutional Rewriting Theorem and Phase-Space Reconstruction</w:t>
       </w:r>
     </w:p>
-    <w:bookmarkStart w:id="49" w:name="X7f0299fde98860a64196c1a70ee761b440475d3"/>
+    <w:bookmarkStart w:id="50" w:name="X7f0299fde98860a64196c1a70ee761b440475d3"/>
     <w:p>
       <w:pPr>
         <w:pStyle w:val="Heading4"/>
@@ -11018,11 +11369,11 @@
         <w:t xml:space="preserve">.</w:t>
       </w:r>
     </w:p>
-    <w:bookmarkEnd w:id="49"/>
     <w:bookmarkEnd w:id="50"/>
     <w:bookmarkEnd w:id="51"/>
     <w:bookmarkEnd w:id="52"/>
-    <w:bookmarkStart w:id="70" w:name="Xe1c000be46c63c25d1ae243fc1e938279cd8da4"/>
+    <w:bookmarkEnd w:id="53"/>
+    <w:bookmarkStart w:id="71" w:name="Xe1c000be46c63c25d1ae243fc1e938279cd8da4"/>
     <w:p>
       <w:pPr>
         <w:pStyle w:val="Heading1"/>
@@ -11031,7 +11382,7 @@
         <w:t xml:space="preserve">Volume IV: Carbon-Silicon Co-Evolution and Physical Verdicts</w:t>
       </w:r>
     </w:p>
-    <w:bookmarkStart w:id="64" w:name="Xcadd7ad361c1cff67da2611cadaabba273ae98f"/>
+    <w:bookmarkStart w:id="65" w:name="Xcadd7ad361c1cff67da2611cadaabba273ae98f"/>
     <w:p>
       <w:pPr>
         <w:pStyle w:val="Heading2"/>
@@ -11040,7 +11391,7 @@
         <w:t xml:space="preserve">Chapter 8: AGI Physical Boundaries and Human-Machine Collaboration Theorems</w:t>
       </w:r>
     </w:p>
-    <w:bookmarkStart w:id="53" w:name="X55d1a8308b519a8125ed4038efd7e7bc0b6bfdf"/>
+    <w:bookmarkStart w:id="54" w:name="X55d1a8308b519a8125ed4038efd7e7bc0b6bfdf"/>
     <w:p>
       <w:pPr>
         <w:pStyle w:val="Heading3"/>
@@ -11057,8 +11408,8 @@
         <w:t xml:space="preserve">Pure silicon systems operating without second-order metacognition are strictly bounded by Gödel’s Incompleteness Theorem and Turing’s Halting Problem. They cannot self-heal across OOD boundaries without carbon-based metacognitive intervention.</w:t>
       </w:r>
     </w:p>
-    <w:bookmarkEnd w:id="53"/>
-    <w:bookmarkStart w:id="57" w:name="Xf73a27004a9e60e0add4a02b7d7f9211a040059"/>
+    <w:bookmarkEnd w:id="54"/>
+    <w:bookmarkStart w:id="58" w:name="Xf73a27004a9e60e0add4a02b7d7f9211a040059"/>
     <w:p>
       <w:pPr>
         <w:pStyle w:val="Heading3"/>
@@ -11067,7 +11418,7 @@
         <w:t xml:space="preserve">§8.2 Hardware-Level Fuse Bounce Mechanism and Silicon Pain Simulation for LLM Hallucination Overcoming</w:t>
       </w:r>
     </w:p>
-    <w:bookmarkStart w:id="54" w:name="X1d0e8a4b3f5f253d65deaaaa55d45b4d110393a"/>
+    <w:bookmarkStart w:id="55" w:name="X1d0e8a4b3f5f253d65deaaaa55d45b4d110393a"/>
     <w:p>
       <w:pPr>
         <w:pStyle w:val="Heading4"/>
@@ -11080,17 +11431,8 @@
       <w:tblPr>
         <w:tblStyle w:val="Table"/>
         <w:tblW w:type="pct" w:w="5000"/>
-        <w:jc w:val="center"/>
         <w:tblLayout w:type="fixed"/>
         <w:tblLook w:firstRow="1" w:lastRow="0" w:firstColumn="0" w:lastColumn="0" w:noHBand="0" w:noVBand="0" w:val="0020"/>
-        <w:tblBorders>
-          <w:top w:val="single" w:sz="12" w:space="0" w:color="1B365D"/>
-          <w:bottom w:val="single" w:sz="12" w:space="0" w:color="1B365D"/>
-          <w:insideH w:val="single" w:sz="4" w:space="0" w:color="E0E0E0"/>
-          <w:left w:val="none"/>
-          <w:right w:val="none"/>
-          <w:insideV w:val="none"/>
-        </w:tblBorders>
       </w:tblPr>
       <w:tblGrid>
         <w:gridCol w:w="2640"/>
@@ -11102,55 +11444,37 @@
           <w:tblHeader w:val="on"/>
         </w:trPr>
         <w:tc>
-          <w:tcPr>
-            <w:shd w:fill="1B365D"/>
-          </w:tcPr>
+          <w:tcPr/>
           <w:p>
             <w:pPr>
               <w:pStyle w:val="Compact"/>
-              <w:jc w:val="center"/>
+              <w:jc w:val="left"/>
             </w:pPr>
             <w:r>
-              <w:rPr>
-                <w:b/>
-                <w:color w:val="FFFFFF"/>
-              </w:rPr>
               <w:t xml:space="preserve">Comparison Dimension</w:t>
             </w:r>
           </w:p>
         </w:tc>
         <w:tc>
-          <w:tcPr>
-            <w:shd w:fill="1B365D"/>
-          </w:tcPr>
+          <w:tcPr/>
           <w:p>
             <w:pPr>
               <w:pStyle w:val="Compact"/>
-              <w:jc w:val="center"/>
+              <w:jc w:val="left"/>
             </w:pPr>
             <w:r>
-              <w:rPr>
-                <w:b/>
-                <w:color w:val="FFFFFF"/>
-              </w:rPr>
               <w:t xml:space="preserve">Software Guardrails (e.g., Llama Guard, Prompt Filters)</w:t>
             </w:r>
           </w:p>
         </w:tc>
         <w:tc>
-          <w:tcPr>
-            <w:shd w:fill="1B365D"/>
-          </w:tcPr>
+          <w:tcPr/>
           <w:p>
             <w:pPr>
               <w:pStyle w:val="Compact"/>
-              <w:jc w:val="center"/>
+              <w:jc w:val="left"/>
             </w:pPr>
             <w:r>
-              <w:rPr>
-                <w:b/>
-                <w:color w:val="FFFFFF"/>
-              </w:rPr>
               <w:t xml:space="preserve">Hardware-Level Physical Fuse (5D Architecture)</w:t>
             </w:r>
           </w:p>
@@ -11158,9 +11482,7 @@
       </w:tr>
       <w:tr>
         <w:tc>
-          <w:tcPr>
-            <w:shd w:fill="F8F9FA"/>
-          </w:tcPr>
+          <w:tcPr/>
           <w:p>
             <w:pPr>
               <w:pStyle w:val="Compact"/>
@@ -11176,9 +11498,7 @@
           </w:p>
         </w:tc>
         <w:tc>
-          <w:tcPr>
-            <w:shd w:fill="F8F9FA"/>
-          </w:tcPr>
+          <w:tcPr/>
           <w:p>
             <w:pPr>
               <w:pStyle w:val="Compact"/>
@@ -11190,9 +11510,7 @@
           </w:p>
         </w:tc>
         <w:tc>
-          <w:tcPr>
-            <w:shd w:fill="F8F9FA"/>
-          </w:tcPr>
+          <w:tcPr/>
           <w:p>
             <w:pPr>
               <w:pStyle w:val="Compact"/>
@@ -11206,9 +11524,7 @@
       </w:tr>
       <w:tr>
         <w:tc>
-          <w:tcPr>
-            <w:shd w:fill="FFFFFF"/>
-          </w:tcPr>
+          <w:tcPr/>
           <w:p>
             <w:pPr>
               <w:pStyle w:val="Compact"/>
@@ -11224,9 +11540,7 @@
           </w:p>
         </w:tc>
         <w:tc>
-          <w:tcPr>
-            <w:shd w:fill="FFFFFF"/>
-          </w:tcPr>
+          <w:tcPr/>
           <w:p>
             <w:pPr>
               <w:pStyle w:val="Compact"/>
@@ -11262,9 +11576,7 @@
           </w:p>
         </w:tc>
         <w:tc>
-          <w:tcPr>
-            <w:shd w:fill="FFFFFF"/>
-          </w:tcPr>
+          <w:tcPr/>
           <w:p>
             <w:pPr>
               <w:pStyle w:val="Compact"/>
@@ -11305,9 +11617,7 @@
       </w:tr>
       <w:tr>
         <w:tc>
-          <w:tcPr>
-            <w:shd w:fill="F8F9FA"/>
-          </w:tcPr>
+          <w:tcPr/>
           <w:p>
             <w:pPr>
               <w:pStyle w:val="Compact"/>
@@ -11323,9 +11633,7 @@
           </w:p>
         </w:tc>
         <w:tc>
-          <w:tcPr>
-            <w:shd w:fill="F8F9FA"/>
-          </w:tcPr>
+          <w:tcPr/>
           <w:p>
             <w:pPr>
               <w:pStyle w:val="Compact"/>
@@ -11337,9 +11645,7 @@
           </w:p>
         </w:tc>
         <w:tc>
-          <w:tcPr>
-            <w:shd w:fill="F8F9FA"/>
-          </w:tcPr>
+          <w:tcPr/>
           <w:p>
             <w:pPr>
               <w:pStyle w:val="Compact"/>
@@ -11352,8 +11658,8 @@
         </w:tc>
       </w:tr>
     </w:tbl>
-    <w:bookmarkEnd w:id="54"/>
-    <w:bookmarkStart w:id="55" w:name="X81a35caa090b5c5a420f6e6db9d0b1e52989069"/>
+    <w:bookmarkEnd w:id="55"/>
+    <w:bookmarkStart w:id="56" w:name="X81a35caa090b5c5a420f6e6db9d0b1e52989069"/>
     <w:p>
       <w:pPr>
         <w:pStyle w:val="Heading4"/>
@@ -11507,8 +11813,8 @@
         <w:t xml:space="preserve">.</w:t>
       </w:r>
     </w:p>
-    <w:bookmarkEnd w:id="55"/>
-    <w:bookmarkStart w:id="56" w:name="X68c22fb7c1fc6847d7aac26b1206a02f0187b77"/>
+    <w:bookmarkEnd w:id="56"/>
+    <w:bookmarkStart w:id="57" w:name="X68c22fb7c1fc6847d7aac26b1206a02f0187b77"/>
     <w:p>
       <w:pPr>
         <w:pStyle w:val="Heading4"/>
@@ -11634,9 +11940,9 @@
         <w:t xml:space="preserve">as biological DMN/BA10 networks.</w:t>
       </w:r>
     </w:p>
-    <w:bookmarkEnd w:id="56"/>
     <w:bookmarkEnd w:id="57"/>
-    <w:bookmarkStart w:id="58" w:name="X566f11925dee5245f01fc356785cc5c8d138d4f"/>
+    <w:bookmarkEnd w:id="58"/>
+    <w:bookmarkStart w:id="59" w:name="X566f11925dee5245f01fc356785cc5c8d138d4f"/>
     <w:p>
       <w:pPr>
         <w:pStyle w:val="Heading3"/>
@@ -11656,7 +11962,6 @@
     <w:p>
       <w:pPr>
         <w:pStyle w:val="BodyText"/>
-        <w:jc w:val="center"/>
       </w:pPr>
       <m:oMathPara>
         <m:oMathParaPr>
@@ -11759,8 +12064,8 @@
         <w:t xml:space="preserve">Carbon-silicon synergy is the necessary and sufficient physical condition for overcoming computational irreducibility in open complex giant systems.</w:t>
       </w:r>
     </w:p>
-    <w:bookmarkEnd w:id="58"/>
-    <w:bookmarkStart w:id="63" w:name="X57b07ff1e9633c6a0eb8bc7e02e1dd7729de6ec"/>
+    <w:bookmarkEnd w:id="59"/>
+    <w:bookmarkStart w:id="64" w:name="X57b07ff1e9633c6a0eb8bc7e02e1dd7729de6ec"/>
     <w:p>
       <w:pPr>
         <w:pStyle w:val="Heading3"/>
@@ -11769,7 +12074,7 @@
         <w:t xml:space="preserve">§8.4 Biological Distribution, Paradigm Shifter Topology, and Engineering Scalability of 5D Mind</w:t>
       </w:r>
     </w:p>
-    <w:bookmarkStart w:id="59" w:name="Xfd2abeade273827802406e0762c7b729dd4af70"/>
+    <w:bookmarkStart w:id="60" w:name="Xfd2abeade273827802406e0762c7b729dd4af70"/>
     <w:p>
       <w:pPr>
         <w:pStyle w:val="Heading4"/>
@@ -11806,8 +12111,8 @@
         <w:t xml:space="preserve">) quench individual metacognitive capacity. Systems must establish executive core protection zones.</w:t>
       </w:r>
     </w:p>
-    <w:bookmarkEnd w:id="59"/>
-    <w:bookmarkStart w:id="60" w:name="X8b08d065cb14de6768de6da42bb9b6d5da72ee1"/>
+    <w:bookmarkEnd w:id="60"/>
+    <w:bookmarkStart w:id="61" w:name="X8b08d065cb14de6768de6da42bb9b6d5da72ee1"/>
     <w:p>
       <w:pPr>
         <w:pStyle w:val="Heading4"/>
@@ -11819,7 +12124,6 @@
     <w:p>
       <w:pPr>
         <w:pStyle w:val="FirstParagraph"/>
-        <w:jc w:val="center"/>
       </w:pPr>
       <m:oMathPara>
         <m:oMathParaPr>
@@ -12130,8 +12434,8 @@
         </m:oMath>
       </m:oMathPara>
     </w:p>
-    <w:bookmarkEnd w:id="60"/>
-    <w:bookmarkStart w:id="61" w:name="X5d10e8192c95ba95be5a6c703627eceae0959d1"/>
+    <w:bookmarkEnd w:id="61"/>
+    <w:bookmarkStart w:id="62" w:name="X5d10e8192c95ba95be5a6c703627eceae0959d1"/>
     <w:p>
       <w:pPr>
         <w:pStyle w:val="Heading4"/>
@@ -12385,8 +12689,8 @@
         <w:t xml:space="preserve">).</w:t>
       </w:r>
     </w:p>
-    <w:bookmarkEnd w:id="61"/>
-    <w:bookmarkStart w:id="62" w:name="Xf0a8618b1e2ee11c99fd50848532ff0f1978023"/>
+    <w:bookmarkEnd w:id="62"/>
+    <w:bookmarkStart w:id="63" w:name="Xf0a8618b1e2ee11c99fd50848532ff0f1978023"/>
     <w:p>
       <w:pPr>
         <w:pStyle w:val="Heading4"/>
@@ -12561,10 +12865,10 @@
         <w:t xml:space="preserve">represent the organizational embodiment of Meta-System Architects. The 5D Mind Model serves as the micro-level L0 cognitive OS operating this Department.</w:t>
       </w:r>
     </w:p>
-    <w:bookmarkEnd w:id="62"/>
     <w:bookmarkEnd w:id="63"/>
     <w:bookmarkEnd w:id="64"/>
-    <w:bookmarkStart w:id="69" w:name="Xa09d708a7ab0734a25131dd2f44403669028eb0"/>
+    <w:bookmarkEnd w:id="65"/>
+    <w:bookmarkStart w:id="70" w:name="Xa09d708a7ab0734a25131dd2f44403669028eb0"/>
     <w:p>
       <w:pPr>
         <w:pStyle w:val="Heading2"/>
@@ -12573,7 +12877,7 @@
         <w:t xml:space="preserve">Chapter 9: Scientific Hypothesis Declaration and Three Falsifiability Criteria</w:t>
       </w:r>
     </w:p>
-    <w:bookmarkStart w:id="65" w:name="X177b8627f5d7c0ed7cea61c9e8981546c143460"/>
+    <w:bookmarkStart w:id="66" w:name="X177b8627f5d7c0ed7cea61c9e8981546c143460"/>
     <w:p>
       <w:pPr>
         <w:pStyle w:val="Heading3"/>
@@ -12590,8 +12894,8 @@
         <w:t xml:space="preserve">This monograph presents a falsifiable scientific hypothesis based on non-equilibrium thermodynamics, cybernetics, and neurobiology.</w:t>
       </w:r>
     </w:p>
-    <w:bookmarkEnd w:id="65"/>
-    <w:bookmarkStart w:id="66" w:name="X9eca34bebcd304100e5a392bd62ff7201297c6c"/>
+    <w:bookmarkEnd w:id="66"/>
+    <w:bookmarkStart w:id="67" w:name="X9eca34bebcd304100e5a392bd62ff7201297c6c"/>
     <w:p>
       <w:pPr>
         <w:pStyle w:val="Heading3"/>
@@ -13485,8 +13789,8 @@
         <w:t xml:space="preserve">). If any dimension is missing yet entropy remains stable without collapse, the hypothesis is falsified.</w:t>
       </w:r>
     </w:p>
-    <w:bookmarkEnd w:id="66"/>
-    <w:bookmarkStart w:id="67" w:name="Xe9c7cdb9d4069707c0a137d2195128a91570aba"/>
+    <w:bookmarkEnd w:id="67"/>
+    <w:bookmarkStart w:id="68" w:name="Xe9c7cdb9d4069707c0a137d2195128a91570aba"/>
     <w:p>
       <w:pPr>
         <w:pStyle w:val="Heading3"/>
@@ -13499,17 +13803,8 @@
       <w:tblPr>
         <w:tblStyle w:val="Table"/>
         <w:tblW w:type="pct" w:w="5000"/>
-        <w:jc w:val="center"/>
         <w:tblLayout w:type="fixed"/>
         <w:tblLook w:firstRow="1" w:lastRow="0" w:firstColumn="0" w:lastColumn="0" w:noHBand="0" w:noVBand="0" w:val="0020"/>
-        <w:tblBorders>
-          <w:top w:val="single" w:sz="12" w:space="0" w:color="1B365D"/>
-          <w:bottom w:val="single" w:sz="12" w:space="0" w:color="1B365D"/>
-          <w:insideH w:val="single" w:sz="4" w:space="0" w:color="E0E0E0"/>
-          <w:left w:val="none"/>
-          <w:right w:val="none"/>
-          <w:insideV w:val="none"/>
-        </w:tblBorders>
       </w:tblPr>
       <w:tblGrid>
         <w:gridCol w:w="1980"/>
@@ -13522,73 +13817,49 @@
           <w:tblHeader w:val="on"/>
         </w:trPr>
         <w:tc>
-          <w:tcPr>
-            <w:shd w:fill="1B365D"/>
-          </w:tcPr>
+          <w:tcPr/>
           <w:p>
             <w:pPr>
               <w:pStyle w:val="Compact"/>
-              <w:jc w:val="center"/>
+              <w:jc w:val="left"/>
             </w:pPr>
             <w:r>
-              <w:rPr>
-                <w:b/>
-                <w:color w:val="FFFFFF"/>
-              </w:rPr>
               <w:t xml:space="preserve">Testing Dimension</w:t>
             </w:r>
           </w:p>
         </w:tc>
         <w:tc>
-          <w:tcPr>
-            <w:shd w:fill="1B365D"/>
-          </w:tcPr>
+          <w:tcPr/>
           <w:p>
             <w:pPr>
               <w:pStyle w:val="Compact"/>
-              <w:jc w:val="center"/>
+              <w:jc w:val="left"/>
             </w:pPr>
             <w:r>
-              <w:rPr>
-                <w:b/>
-                <w:color w:val="FFFFFF"/>
-              </w:rPr>
               <w:t xml:space="preserve">Measurement Metric</w:t>
             </w:r>
           </w:p>
         </w:tc>
         <w:tc>
-          <w:tcPr>
-            <w:shd w:fill="1B365D"/>
-          </w:tcPr>
+          <w:tcPr/>
           <w:p>
             <w:pPr>
               <w:pStyle w:val="Compact"/>
-              <w:jc w:val="center"/>
+              <w:jc w:val="left"/>
             </w:pPr>
             <w:r>
-              <w:rPr>
-                <w:b/>
-                <w:color w:val="FFFFFF"/>
-              </w:rPr>
               <w:t xml:space="preserve">Pass Threshold</w:t>
             </w:r>
           </w:p>
         </w:tc>
         <w:tc>
-          <w:tcPr>
-            <w:shd w:fill="1B365D"/>
-          </w:tcPr>
+          <w:tcPr/>
           <w:p>
             <w:pPr>
               <w:pStyle w:val="Compact"/>
-              <w:jc w:val="center"/>
+              <w:jc w:val="left"/>
             </w:pPr>
             <w:r>
-              <w:rPr>
-                <w:b/>
-                <w:color w:val="FFFFFF"/>
-              </w:rPr>
               <w:t xml:space="preserve">Rejection Domain (Hypothesis Refuted)</w:t>
             </w:r>
           </w:p>
@@ -13596,9 +13867,7 @@
       </w:tr>
       <w:tr>
         <w:tc>
-          <w:tcPr>
-            <w:shd w:fill="F8F9FA"/>
-          </w:tcPr>
+          <w:tcPr/>
           <w:p>
             <w:pPr>
               <w:pStyle w:val="Compact"/>
@@ -13614,9 +13883,7 @@
           </w:p>
         </w:tc>
         <w:tc>
-          <w:tcPr>
-            <w:shd w:fill="F8F9FA"/>
-          </w:tcPr>
+          <w:tcPr/>
           <w:p>
             <w:pPr>
               <w:pStyle w:val="Compact"/>
@@ -13636,9 +13903,7 @@
           </w:p>
         </w:tc>
         <w:tc>
-          <w:tcPr>
-            <w:shd w:fill="F8F9FA"/>
-          </w:tcPr>
+          <w:tcPr/>
           <w:p>
             <w:pPr>
               <w:pStyle w:val="Compact"/>
@@ -13667,9 +13932,7 @@
           </w:p>
         </w:tc>
         <w:tc>
-          <w:tcPr>
-            <w:shd w:fill="F8F9FA"/>
-          </w:tcPr>
+          <w:tcPr/>
           <w:p>
             <w:pPr>
               <w:pStyle w:val="Compact"/>
@@ -13700,9 +13963,7 @@
       </w:tr>
       <w:tr>
         <w:tc>
-          <w:tcPr>
-            <w:shd w:fill="FFFFFF"/>
-          </w:tcPr>
+          <w:tcPr/>
           <w:p>
             <w:pPr>
               <w:pStyle w:val="Compact"/>
@@ -13718,9 +13979,7 @@
           </w:p>
         </w:tc>
         <w:tc>
-          <w:tcPr>
-            <w:shd w:fill="FFFFFF"/>
-          </w:tcPr>
+          <w:tcPr/>
           <w:p>
             <w:pPr>
               <w:pStyle w:val="Compact"/>
@@ -13753,9 +14012,7 @@
           </w:p>
         </w:tc>
         <w:tc>
-          <w:tcPr>
-            <w:shd w:fill="FFFFFF"/>
-          </w:tcPr>
+          <w:tcPr/>
           <w:p>
             <w:pPr>
               <w:pStyle w:val="Compact"/>
@@ -13800,9 +14057,7 @@
           </w:p>
         </w:tc>
         <w:tc>
-          <w:tcPr>
-            <w:shd w:fill="FFFFFF"/>
-          </w:tcPr>
+          <w:tcPr/>
           <w:p>
             <w:pPr>
               <w:pStyle w:val="Compact"/>
@@ -13852,9 +14107,7 @@
       </w:tr>
       <w:tr>
         <w:tc>
-          <w:tcPr>
-            <w:shd w:fill="F8F9FA"/>
-          </w:tcPr>
+          <w:tcPr/>
           <w:p>
             <w:pPr>
               <w:pStyle w:val="Compact"/>
@@ -13870,9 +14123,7 @@
           </w:p>
         </w:tc>
         <w:tc>
-          <w:tcPr>
-            <w:shd w:fill="F8F9FA"/>
-          </w:tcPr>
+          <w:tcPr/>
           <w:p>
             <w:pPr>
               <w:pStyle w:val="Compact"/>
@@ -13923,9 +14174,7 @@
           </w:p>
         </w:tc>
         <w:tc>
-          <w:tcPr>
-            <w:shd w:fill="F8F9FA"/>
-          </w:tcPr>
+          <w:tcPr/>
           <w:p>
             <w:pPr>
               <w:pStyle w:val="Compact"/>
@@ -13982,9 +14231,7 @@
           </w:p>
         </w:tc>
         <w:tc>
-          <w:tcPr>
-            <w:shd w:fill="F8F9FA"/>
-          </w:tcPr>
+          <w:tcPr/>
           <w:p>
             <w:pPr>
               <w:pStyle w:val="Compact"/>
@@ -14046,9 +14293,7 @@
       </w:tr>
       <w:tr>
         <w:tc>
-          <w:tcPr>
-            <w:shd w:fill="FFFFFF"/>
-          </w:tcPr>
+          <w:tcPr/>
           <w:p>
             <w:pPr>
               <w:pStyle w:val="Compact"/>
@@ -14064,9 +14309,7 @@
           </w:p>
         </w:tc>
         <w:tc>
-          <w:tcPr>
-            <w:shd w:fill="FFFFFF"/>
-          </w:tcPr>
+          <w:tcPr/>
           <w:p>
             <w:pPr>
               <w:pStyle w:val="Compact"/>
@@ -14124,9 +14367,7 @@
           </w:p>
         </w:tc>
         <w:tc>
-          <w:tcPr>
-            <w:shd w:fill="FFFFFF"/>
-          </w:tcPr>
+          <w:tcPr/>
           <w:p>
             <w:pPr>
               <w:pStyle w:val="Compact"/>
@@ -14138,9 +14379,7 @@
           </w:p>
         </w:tc>
         <w:tc>
-          <w:tcPr>
-            <w:shd w:fill="FFFFFF"/>
-          </w:tcPr>
+          <w:tcPr/>
           <w:p>
             <w:pPr>
               <w:pStyle w:val="Compact"/>
@@ -14174,9 +14413,7 @@
       </w:tr>
       <w:tr>
         <w:tc>
-          <w:tcPr>
-            <w:shd w:fill="F8F9FA"/>
-          </w:tcPr>
+          <w:tcPr/>
           <w:p>
             <w:pPr>
               <w:pStyle w:val="Compact"/>
@@ -14192,9 +14429,7 @@
           </w:p>
         </w:tc>
         <w:tc>
-          <w:tcPr>
-            <w:shd w:fill="F8F9FA"/>
-          </w:tcPr>
+          <w:tcPr/>
           <w:p>
             <w:pPr>
               <w:pStyle w:val="Compact"/>
@@ -14226,9 +14461,7 @@
           </w:p>
         </w:tc>
         <w:tc>
-          <w:tcPr>
-            <w:shd w:fill="F8F9FA"/>
-          </w:tcPr>
+          <w:tcPr/>
           <w:p>
             <w:pPr>
               <w:pStyle w:val="Compact"/>
@@ -14260,9 +14493,7 @@
           </w:p>
         </w:tc>
         <w:tc>
-          <w:tcPr>
-            <w:shd w:fill="F8F9FA"/>
-          </w:tcPr>
+          <w:tcPr/>
           <w:p>
             <w:pPr>
               <w:pStyle w:val="Compact"/>
@@ -14295,8 +14526,8 @@
         </w:tc>
       </w:tr>
     </w:tbl>
-    <w:bookmarkEnd w:id="67"/>
-    <w:bookmarkStart w:id="68" w:name="X92f4494cc089be5a341ae4044f2067c6a01ff09"/>
+    <w:bookmarkEnd w:id="68"/>
+    <w:bookmarkStart w:id="69" w:name="X92f4494cc089be5a341ae4044f2067c6a01ff09"/>
     <w:p>
       <w:pPr>
         <w:pStyle w:val="Heading3"/>
@@ -14392,10 +14623,10 @@
         </w:pict>
       </w:r>
     </w:p>
-    <w:bookmarkEnd w:id="68"/>
     <w:bookmarkEnd w:id="69"/>
     <w:bookmarkEnd w:id="70"/>
-    <w:bookmarkStart w:id="75" w:name="X80a06b0ce23d5c57259306cff6f72cf7fb8f256"/>
+    <w:bookmarkEnd w:id="71"/>
+    <w:bookmarkStart w:id="76" w:name="X80a06b0ce23d5c57259306cff6f72cf7fb8f256"/>
     <w:p>
       <w:pPr>
         <w:pStyle w:val="Heading1"/>
@@ -14404,7 +14635,7 @@
         <w:t xml:space="preserve">Appendix A: Second-Order Cybernetic Isomorphism with Wang Yangming’s Philosophy of Mind</w:t>
       </w:r>
     </w:p>
-    <w:bookmarkStart w:id="71" w:name="Xfc92c0b8303af4c920b098533d540731ea788b5"/>
+    <w:bookmarkStart w:id="72" w:name="Xfc92c0b8303af4c920b098533d540731ea788b5"/>
     <w:p>
       <w:pPr>
         <w:pStyle w:val="Heading2"/>
@@ -14543,8 +14774,8 @@
         <w:t xml:space="preserve">that stops the system from violating physical reality.</w:t>
       </w:r>
     </w:p>
-    <w:bookmarkEnd w:id="71"/>
-    <w:bookmarkStart w:id="72" w:name="Xbc65c4d88e2242196b6f7879cb1d7b49a51b9b9"/>
+    <w:bookmarkEnd w:id="72"/>
+    <w:bookmarkStart w:id="73" w:name="Xbc65c4d88e2242196b6f7879cb1d7b49a51b9b9"/>
     <w:p>
       <w:pPr>
         <w:pStyle w:val="Heading2"/>
@@ -14676,8 +14907,8 @@
         <w:t xml:space="preserve">.</w:t>
       </w:r>
     </w:p>
-    <w:bookmarkEnd w:id="72"/>
-    <w:bookmarkStart w:id="73" w:name="Xf26840fe1d549b10f02c1722beebae2c58ee1d9"/>
+    <w:bookmarkEnd w:id="73"/>
+    <w:bookmarkStart w:id="74" w:name="Xf26840fe1d549b10f02c1722beebae2c58ee1d9"/>
     <w:p>
       <w:pPr>
         <w:pStyle w:val="Heading2"/>
@@ -14851,8 +15082,8 @@
         <w:t xml:space="preserve">.</w:t>
       </w:r>
     </w:p>
-    <w:bookmarkEnd w:id="73"/>
-    <w:bookmarkStart w:id="74" w:name="X3806e23210def28740242a5f3df1fdf9c445b02"/>
+    <w:bookmarkEnd w:id="74"/>
+    <w:bookmarkStart w:id="75" w:name="X3806e23210def28740242a5f3df1fdf9c445b02"/>
     <w:p>
       <w:pPr>
         <w:pStyle w:val="Heading2"/>
@@ -14876,9 +15107,9 @@
         </w:pict>
       </w:r>
     </w:p>
-    <w:bookmarkEnd w:id="74"/>
     <w:bookmarkEnd w:id="75"/>
-    <w:bookmarkStart w:id="77" w:name="appendix-b-references"/>
+    <w:bookmarkEnd w:id="76"/>
+    <w:bookmarkStart w:id="78" w:name="appendix-b-references"/>
     <w:p>
       <w:pPr>
         <w:pStyle w:val="Heading1"/>
@@ -15567,7 +15798,7 @@
           <w:numId w:val="1015"/>
         </w:numPr>
       </w:pPr>
-      <w:bookmarkStart w:id="76" w:name="Xce0cb23961380929d71ac03ee527dd762a32710"/>
+      <w:bookmarkStart w:id="77" w:name="Xce0cb23961380929d71ac03ee527dd762a32710"/>
       <w:r>
         <w:rPr>
           <w:b/>
@@ -15591,10 +15822,10 @@
       <w:r>
         <w:t xml:space="preserve">, 51(4), 661-703.</w:t>
       </w:r>
-      <w:bookmarkEnd w:id="76"/>
-    </w:p>
-    <w:bookmarkEnd w:id="77"/>
-    <w:bookmarkStart w:id="78" w:name="X184d911b906b6520de62cc6ae6e2d23ff114031"/>
+      <w:bookmarkEnd w:id="77"/>
+    </w:p>
+    <w:bookmarkEnd w:id="78"/>
+    <w:bookmarkStart w:id="79" w:name="X184d911b906b6520de62cc6ae6e2d23ff114031"/>
     <w:p>
       <w:pPr>
         <w:pStyle w:val="Heading1"/>
@@ -15657,17 +15888,8 @@
       <w:tblPr>
         <w:tblStyle w:val="Table"/>
         <w:tblW w:type="pct" w:w="5000"/>
-        <w:jc w:val="center"/>
         <w:tblLayout w:type="fixed"/>
         <w:tblLook w:firstRow="1" w:lastRow="0" w:firstColumn="0" w:lastColumn="0" w:noHBand="0" w:noVBand="0" w:val="0020"/>
-        <w:tblBorders>
-          <w:top w:val="single" w:sz="12" w:space="0" w:color="1B365D"/>
-          <w:bottom w:val="single" w:sz="12" w:space="0" w:color="1B365D"/>
-          <w:insideH w:val="single" w:sz="4" w:space="0" w:color="E0E0E0"/>
-          <w:left w:val="none"/>
-          <w:right w:val="none"/>
-          <w:insideV w:val="none"/>
-        </w:tblBorders>
       </w:tblPr>
       <w:tblGrid>
         <w:gridCol w:w="1980"/>
@@ -15680,73 +15902,49 @@
           <w:tblHeader w:val="on"/>
         </w:trPr>
         <w:tc>
-          <w:tcPr>
-            <w:shd w:fill="1B365D"/>
-          </w:tcPr>
+          <w:tcPr/>
           <w:p>
             <w:pPr>
               <w:pStyle w:val="Compact"/>
-              <w:jc w:val="center"/>
+              <w:jc w:val="left"/>
             </w:pPr>
             <w:r>
-              <w:rPr>
-                <w:b/>
-                <w:color w:val="FFFFFF"/>
-              </w:rPr>
               <w:t xml:space="preserve">Qian Xuesen Systems Science Term</w:t>
             </w:r>
           </w:p>
         </w:tc>
         <w:tc>
-          <w:tcPr>
-            <w:shd w:fill="1B365D"/>
-          </w:tcPr>
+          <w:tcPr/>
           <w:p>
             <w:pPr>
               <w:pStyle w:val="Compact"/>
-              <w:jc w:val="center"/>
+              <w:jc w:val="left"/>
             </w:pPr>
             <w:r>
-              <w:rPr>
-                <w:b/>
-                <w:color w:val="FFFFFF"/>
-              </w:rPr>
               <w:t xml:space="preserve">Cybernetic Physical Function</w:t>
             </w:r>
           </w:p>
         </w:tc>
         <w:tc>
-          <w:tcPr>
-            <w:shd w:fill="1B365D"/>
-          </w:tcPr>
+          <w:tcPr/>
           <w:p>
             <w:pPr>
               <w:pStyle w:val="Compact"/>
-              <w:jc w:val="center"/>
+              <w:jc w:val="left"/>
             </w:pPr>
             <w:r>
-              <w:rPr>
-                <w:b/>
-                <w:color w:val="FFFFFF"/>
-              </w:rPr>
               <w:t xml:space="preserve">5D Mind Model Isomorphic Operator</w:t>
             </w:r>
           </w:p>
         </w:tc>
         <w:tc>
-          <w:tcPr>
-            <w:shd w:fill="1B365D"/>
-          </w:tcPr>
+          <w:tcPr/>
           <w:p>
             <w:pPr>
               <w:pStyle w:val="Compact"/>
-              <w:jc w:val="center"/>
+              <w:jc w:val="left"/>
             </w:pPr>
             <w:r>
-              <w:rPr>
-                <w:b/>
-                <w:color w:val="FFFFFF"/>
-              </w:rPr>
               <w:t xml:space="preserve">Engineering Utility in Problem Redefinition</w:t>
             </w:r>
           </w:p>
@@ -15754,9 +15952,7 @@
       </w:tr>
       <w:tr>
         <w:tc>
-          <w:tcPr>
-            <w:shd w:fill="F8F9FA"/>
-          </w:tcPr>
+          <w:tcPr/>
           <w:p>
             <w:pPr>
               <w:pStyle w:val="Compact"/>
@@ -15772,9 +15968,7 @@
           </w:p>
         </w:tc>
         <w:tc>
-          <w:tcPr>
-            <w:shd w:fill="F8F9FA"/>
-          </w:tcPr>
+          <w:tcPr/>
           <w:p>
             <w:pPr>
               <w:pStyle w:val="Compact"/>
@@ -15822,9 +16016,7 @@
           </w:p>
         </w:tc>
         <w:tc>
-          <w:tcPr>
-            <w:shd w:fill="F8F9FA"/>
-          </w:tcPr>
+          <w:tcPr/>
           <w:p>
             <w:pPr>
               <w:pStyle w:val="Compact"/>
@@ -15875,9 +16067,7 @@
           </w:p>
         </w:tc>
         <w:tc>
-          <w:tcPr>
-            <w:shd w:fill="F8F9FA"/>
-          </w:tcPr>
+          <w:tcPr/>
           <w:p>
             <w:pPr>
               <w:pStyle w:val="Compact"/>
@@ -15891,9 +16081,7 @@
       </w:tr>
       <w:tr>
         <w:tc>
-          <w:tcPr>
-            <w:shd w:fill="FFFFFF"/>
-          </w:tcPr>
+          <w:tcPr/>
           <w:p>
             <w:pPr>
               <w:pStyle w:val="Compact"/>
@@ -15909,9 +16097,7 @@
           </w:p>
         </w:tc>
         <w:tc>
-          <w:tcPr>
-            <w:shd w:fill="FFFFFF"/>
-          </w:tcPr>
+          <w:tcPr/>
           <w:p>
             <w:pPr>
               <w:pStyle w:val="Compact"/>
@@ -15923,9 +16109,7 @@
           </w:p>
         </w:tc>
         <w:tc>
-          <w:tcPr>
-            <w:shd w:fill="FFFFFF"/>
-          </w:tcPr>
+          <w:tcPr/>
           <w:p>
             <w:pPr>
               <w:pStyle w:val="Compact"/>
@@ -15972,9 +16156,7 @@
           </w:p>
         </w:tc>
         <w:tc>
-          <w:tcPr>
-            <w:shd w:fill="FFFFFF"/>
-          </w:tcPr>
+          <w:tcPr/>
           <w:p>
             <w:pPr>
               <w:pStyle w:val="Compact"/>
@@ -15988,9 +16170,7 @@
       </w:tr>
       <w:tr>
         <w:tc>
-          <w:tcPr>
-            <w:shd w:fill="F8F9FA"/>
-          </w:tcPr>
+          <w:tcPr/>
           <w:p>
             <w:pPr>
               <w:pStyle w:val="Compact"/>
@@ -16022,9 +16202,7 @@
           </w:p>
         </w:tc>
         <w:tc>
-          <w:tcPr>
-            <w:shd w:fill="F8F9FA"/>
-          </w:tcPr>
+          <w:tcPr/>
           <w:p>
             <w:pPr>
               <w:pStyle w:val="Compact"/>
@@ -16036,9 +16214,7 @@
           </w:p>
         </w:tc>
         <w:tc>
-          <w:tcPr>
-            <w:shd w:fill="F8F9FA"/>
-          </w:tcPr>
+          <w:tcPr/>
           <w:p>
             <w:pPr>
               <w:pStyle w:val="Compact"/>
@@ -16050,9 +16226,7 @@
           </w:p>
         </w:tc>
         <w:tc>
-          <w:tcPr>
-            <w:shd w:fill="F8F9FA"/>
-          </w:tcPr>
+          <w:tcPr/>
           <w:p>
             <w:pPr>
               <w:pStyle w:val="Compact"/>
@@ -16066,9 +16240,7 @@
       </w:tr>
       <w:tr>
         <w:tc>
-          <w:tcPr>
-            <w:shd w:fill="FFFFFF"/>
-          </w:tcPr>
+          <w:tcPr/>
           <w:p>
             <w:pPr>
               <w:pStyle w:val="Compact"/>
@@ -16100,9 +16272,7 @@
           </w:p>
         </w:tc>
         <w:tc>
-          <w:tcPr>
-            <w:shd w:fill="FFFFFF"/>
-          </w:tcPr>
+          <w:tcPr/>
           <w:p>
             <w:pPr>
               <w:pStyle w:val="Compact"/>
@@ -16114,9 +16284,7 @@
           </w:p>
         </w:tc>
         <w:tc>
-          <w:tcPr>
-            <w:shd w:fill="FFFFFF"/>
-          </w:tcPr>
+          <w:tcPr/>
           <w:p>
             <w:pPr>
               <w:pStyle w:val="Compact"/>
@@ -16148,9 +16316,7 @@
           </w:p>
         </w:tc>
         <w:tc>
-          <w:tcPr>
-            <w:shd w:fill="FFFFFF"/>
-          </w:tcPr>
+          <w:tcPr/>
           <w:p>
             <w:pPr>
               <w:pStyle w:val="Compact"/>
@@ -16163,12 +16329,11 @@
         </w:tc>
       </w:tr>
     </w:tbl>
-    <w:bookmarkEnd w:id="78"/>
+    <w:bookmarkEnd w:id="79"/>
     <w:sectPr>
       <w:footnotePr>
         <w:numRestart w:val="eachSect"/>
       </w:footnotePr>
-      <w:pgMar w:top="1440" w:bottom="1440" w:left="1440" w:right="1440"/>
     </w:sectPr>
   </w:body>
 </w:document>
@@ -16863,11 +17028,6 @@
   <w:style w:default="1" w:styleId="Normal" w:type="paragraph">
     <w:name w:val="Normal"/>
     <w:qFormat/>
-    <w:rPr>
-      <w:rFonts w:ascii="Times New Roman" w:hAnsi="Times New Roman"/>
-      <w:color w:val="111111"/>
-      <w:sz w:val="22"/>
-    </w:rPr>
   </w:style>
   <w:style w:styleId="BodyText" w:type="paragraph">
     <w:name w:val="Body Text"/>

</xml_diff>